<commit_message>
211212 - BLTAnh - Report
</commit_message>
<xml_diff>
--- a/CN01_SDN/docs/19120163_19120128.docx
+++ b/CN01_SDN/docs/19120163_19120128.docx
@@ -45,7 +45,7 @@
                     <pic:cNvPicPr/>
                   </pic:nvPicPr>
                   <pic:blipFill>
-                    <a:blip r:embed="rId8" cstate="print">
+                    <a:blip r:embed="rId11" cstate="print">
                       <a:extLst>
                         <a:ext uri="{28A0092B-C50C-407E-A947-70E740481C1C}">
                           <a14:useLocalDpi xmlns:a14="http://schemas.microsoft.com/office/drawing/2010/main" val="0"/>
@@ -190,7 +190,17 @@
           <w:sz w:val="32"/>
           <w:szCs w:val="32"/>
         </w:rPr>
-        <w:t xml:space="preserve"> CÁO TÓM TẮT</w:t>
+        <w:t xml:space="preserve"> CÁO </w:t>
+      </w:r>
+      <w:r>
+        <w:rPr>
+          <w:rFonts w:ascii="Times New Roman" w:hAnsi="Times New Roman" w:cs="Times New Roman"/>
+          <w:b/>
+          <w:bCs/>
+          <w:sz w:val="32"/>
+          <w:szCs w:val="32"/>
+        </w:rPr>
+        <w:t>ĐỒ ÁN</w:t>
       </w:r>
     </w:p>
     <w:p>
@@ -212,7 +222,7 @@
           <w:sz w:val="32"/>
           <w:szCs w:val="32"/>
         </w:rPr>
-        <w:t xml:space="preserve">TÌM KIẾM ĐƯỜNG ĐI NGẮN NHẤT TRONG </w:t>
+        <w:t>TÌM ĐƯỜNG ĐI NGẮN NHẤT</w:t>
       </w:r>
       <w:r>
         <w:rPr>
@@ -222,7 +232,27 @@
           <w:sz w:val="32"/>
           <w:szCs w:val="32"/>
         </w:rPr>
-        <w:t>RYU CONTROLLER</w:t>
+        <w:t xml:space="preserve"> BẰNG THUẬT TOÁN DIJKSTRA</w:t>
+      </w:r>
+      <w:r>
+        <w:rPr>
+          <w:rFonts w:ascii="Times New Roman" w:hAnsi="Times New Roman" w:cs="Times New Roman"/>
+          <w:b/>
+          <w:bCs/>
+          <w:sz w:val="32"/>
+          <w:szCs w:val="32"/>
+        </w:rPr>
+        <w:t xml:space="preserve"> TRONG</w:t>
+      </w:r>
+      <w:r>
+        <w:rPr>
+          <w:rFonts w:ascii="Times New Roman" w:hAnsi="Times New Roman" w:cs="Times New Roman"/>
+          <w:b/>
+          <w:bCs/>
+          <w:sz w:val="32"/>
+          <w:szCs w:val="32"/>
+        </w:rPr>
+        <w:t xml:space="preserve"> RYU CONTROLLER</w:t>
       </w:r>
     </w:p>
     <w:p>
@@ -584,7 +614,7 @@
           <w:sz w:val="28"/>
           <w:szCs w:val="28"/>
         </w:rPr>
-        <w:t>11</w:t>
+        <w:t>1</w:t>
       </w:r>
       <w:r>
         <w:rPr>
@@ -596,7 +626,7 @@
           <w:sz w:val="28"/>
           <w:szCs w:val="28"/>
         </w:rPr>
-        <w:t xml:space="preserve"> năm </w:t>
+        <w:t>2</w:t>
       </w:r>
       <w:r>
         <w:rPr>
@@ -608,6 +638,18 @@
           <w:sz w:val="28"/>
           <w:szCs w:val="28"/>
         </w:rPr>
+        <w:t xml:space="preserve"> năm </w:t>
+      </w:r>
+      <w:r>
+        <w:rPr>
+          <w:rFonts w:ascii="Times New Roman" w:hAnsi="Times New Roman" w:cs="Times New Roman"/>
+          <w:b/>
+          <w:bCs/>
+          <w:i/>
+          <w:iCs/>
+          <w:sz w:val="28"/>
+          <w:szCs w:val="28"/>
+        </w:rPr>
         <w:t>2021</w:t>
       </w:r>
     </w:p>
@@ -624,7 +666,7 @@
           <w:szCs w:val="28"/>
         </w:rPr>
         <w:sectPr>
-          <w:footerReference w:type="default" r:id="rId9"/>
+          <w:footerReference w:type="default" r:id="rId12"/>
           <w:pgSz w:w="11906" w:h="16838"/>
           <w:pgMar w:top="1418" w:right="1134" w:bottom="1134" w:left="1985" w:header="708" w:footer="708" w:gutter="0"/>
           <w:cols w:space="708"/>
@@ -685,7 +727,7 @@
           <w:r>
             <w:fldChar w:fldCharType="separate"/>
           </w:r>
-          <w:hyperlink w:anchor="_Toc88417882" w:history="1">
+          <w:hyperlink w:anchor="_Toc90189583" w:history="1">
             <w:r>
               <w:rPr>
                 <w:rStyle w:val="Siuktni"/>
@@ -728,7 +770,7 @@
                 <w:noProof/>
                 <w:webHidden/>
               </w:rPr>
-              <w:instrText xml:space="preserve"> PAGEREF _Toc88417882 \h </w:instrText>
+              <w:instrText xml:space="preserve"> PAGEREF _Toc90189583 \h </w:instrText>
             </w:r>
             <w:r>
               <w:rPr>
@@ -773,7 +815,7 @@
               <w:lang w:eastAsia="zh-CN"/>
             </w:rPr>
           </w:pPr>
-          <w:hyperlink w:anchor="_Toc88417883" w:history="1">
+          <w:hyperlink w:anchor="_Toc90189584" w:history="1">
             <w:r>
               <w:rPr>
                 <w:rStyle w:val="Siuktni"/>
@@ -795,7 +837,7 @@
                 <w:rStyle w:val="Siuktni"/>
                 <w:noProof/>
               </w:rPr>
-              <w:t>TÌM KIẾM ĐƯỜNG ĐI NGẮN NHẤT TRONG MẠNG</w:t>
+              <w:t>TÌM ĐƯỜNG ĐI NGẮN NHẤT VỚI RYU CONTROLLER</w:t>
             </w:r>
             <w:r>
               <w:rPr>
@@ -816,7 +858,7 @@
                 <w:noProof/>
                 <w:webHidden/>
               </w:rPr>
-              <w:instrText xml:space="preserve"> PAGEREF _Toc88417883 \h </w:instrText>
+              <w:instrText xml:space="preserve"> PAGEREF _Toc90189584 \h </w:instrText>
             </w:r>
             <w:r>
               <w:rPr>
@@ -851,7 +893,6 @@
           <w:pPr>
             <w:pStyle w:val="Mucluc1"/>
             <w:tabs>
-              <w:tab w:val="left" w:pos="440"/>
               <w:tab w:val="right" w:leader="dot" w:pos="8777"/>
             </w:tabs>
             <w:rPr>
@@ -861,94 +902,7 @@
               <w:lang w:eastAsia="zh-CN"/>
             </w:rPr>
           </w:pPr>
-          <w:hyperlink w:anchor="_Toc88417884" w:history="1">
-            <w:r>
-              <w:rPr>
-                <w:rStyle w:val="Siuktni"/>
-                <w:noProof/>
-              </w:rPr>
-              <w:t>3.</w:t>
-            </w:r>
-            <w:r>
-              <w:rPr>
-                <w:rFonts w:asciiTheme="minorHAnsi" w:eastAsiaTheme="minorEastAsia" w:hAnsiTheme="minorHAnsi"/>
-                <w:noProof/>
-                <w:sz w:val="22"/>
-                <w:lang w:eastAsia="zh-CN"/>
-              </w:rPr>
-              <w:tab/>
-            </w:r>
-            <w:r>
-              <w:rPr>
-                <w:rStyle w:val="Siuktni"/>
-                <w:noProof/>
-              </w:rPr>
-              <w:t>KẾT QUẢ VÀ NHẬN XÉT</w:t>
-            </w:r>
-            <w:r>
-              <w:rPr>
-                <w:noProof/>
-                <w:webHidden/>
-              </w:rPr>
-              <w:tab/>
-            </w:r>
-            <w:r>
-              <w:rPr>
-                <w:noProof/>
-                <w:webHidden/>
-              </w:rPr>
-              <w:fldChar w:fldCharType="begin"/>
-            </w:r>
-            <w:r>
-              <w:rPr>
-                <w:noProof/>
-                <w:webHidden/>
-              </w:rPr>
-              <w:instrText xml:space="preserve"> PAGEREF _Toc88417884 \h </w:instrText>
-            </w:r>
-            <w:r>
-              <w:rPr>
-                <w:noProof/>
-                <w:webHidden/>
-              </w:rPr>
-            </w:r>
-            <w:r>
-              <w:rPr>
-                <w:noProof/>
-                <w:webHidden/>
-              </w:rPr>
-              <w:fldChar w:fldCharType="separate"/>
-            </w:r>
-            <w:r>
-              <w:rPr>
-                <w:noProof/>
-                <w:webHidden/>
-              </w:rPr>
-              <w:t>5</w:t>
-            </w:r>
-            <w:r>
-              <w:rPr>
-                <w:noProof/>
-                <w:webHidden/>
-              </w:rPr>
-              <w:fldChar w:fldCharType="end"/>
-            </w:r>
-          </w:hyperlink>
-        </w:p>
-        <w:p>
-          <w:pPr>
-            <w:pStyle w:val="Mucluc1"/>
-            <w:tabs>
-              <w:tab w:val="right" w:leader="dot" w:pos="8777"/>
-            </w:tabs>
-            <w:rPr>
-              <w:rFonts w:asciiTheme="minorHAnsi" w:eastAsiaTheme="minorEastAsia" w:hAnsiTheme="minorHAnsi"/>
-              <w:noProof/>
-              <w:sz w:val="22"/>
-              <w:lang w:eastAsia="zh-CN"/>
-            </w:rPr>
-          </w:pPr>
-          <w:hyperlink w:anchor="_Toc88417885" w:history="1">
+          <w:hyperlink w:anchor="_Toc90189585" w:history="1">
             <w:r>
               <w:rPr>
                 <w:rStyle w:val="Siuktni"/>
@@ -983,7 +937,7 @@
                 <w:noProof/>
                 <w:webHidden/>
               </w:rPr>
-              <w:instrText xml:space="preserve"> PAGEREF _Toc88417885 \h </w:instrText>
+              <w:instrText xml:space="preserve"> PAGEREF _Toc90189585 \h </w:instrText>
             </w:r>
             <w:r>
               <w:rPr>
@@ -1003,7 +957,7 @@
                 <w:noProof/>
                 <w:webHidden/>
               </w:rPr>
-              <w:t>7</w:t>
+              <w:t>10</w:t>
             </w:r>
             <w:r>
               <w:rPr>
@@ -1079,7 +1033,7 @@
           <w:lang w:val="en-US"/>
         </w:rPr>
         <w:sectPr>
-          <w:footerReference w:type="default" r:id="rId10"/>
+          <w:footerReference w:type="default" r:id="rId13"/>
           <w:pgSz w:w="11906" w:h="16838"/>
           <w:pgMar w:top="1418" w:right="1134" w:bottom="1134" w:left="1985" w:header="708" w:footer="708" w:gutter="0"/>
           <w:pgNumType w:fmt="lowerRoman" w:start="1"/>
@@ -1104,7 +1058,7 @@
           <w:szCs w:val="24"/>
         </w:rPr>
         <w:sectPr>
-          <w:footerReference w:type="default" r:id="rId11"/>
+          <w:footerReference w:type="default" r:id="rId14"/>
           <w:pgSz w:w="11906" w:h="16838"/>
           <w:pgMar w:top="1418" w:right="1134" w:bottom="1134" w:left="1985" w:header="708" w:footer="708" w:gutter="0"/>
           <w:pgNumType w:start="1"/>
@@ -1121,7 +1075,7 @@
           <w:numId w:val="16"/>
         </w:numPr>
       </w:pPr>
-      <w:bookmarkStart w:id="0" w:name="_Toc88417882"/>
+      <w:bookmarkStart w:id="0" w:name="_Toc90189583"/>
       <w:r>
         <w:lastRenderedPageBreak/>
         <w:t>GIỚI THIỆU VỀ RYU CONTROLLER</w:t>
@@ -1130,6 +1084,577 @@
     </w:p>
     <w:p>
       <w:pPr>
+        <w:ind w:firstLine="360"/>
+      </w:pPr>
+      <w:r>
+        <w:t xml:space="preserve">RYU </w:t>
+      </w:r>
+      <w:r>
+        <w:rPr>
+          <w:lang w:eastAsia="zh-CN"/>
+        </w:rPr>
+        <w:t>Controller</w:t>
+      </w:r>
+      <w:r>
+        <w:t xml:space="preserve"> </w:t>
+      </w:r>
+      <w:r>
+        <w:t xml:space="preserve">là một </w:t>
+      </w:r>
+      <w:r>
+        <w:t xml:space="preserve">SDN </w:t>
+      </w:r>
+      <w:r>
+        <w:t>controller</w:t>
+      </w:r>
+      <w:r>
+        <w:t xml:space="preserve">, </w:t>
+      </w:r>
+      <w:r>
+        <w:t xml:space="preserve">chuyên dùng để điều khiển và quản </w:t>
+      </w:r>
+      <w:r>
+        <w:t>lý</w:t>
+      </w:r>
+      <w:r>
+        <w:t xml:space="preserve"> </w:t>
+      </w:r>
+      <w:r>
+        <w:t>các</w:t>
+      </w:r>
+      <w:r>
+        <w:t xml:space="preserve"> đường </w:t>
+      </w:r>
+      <w:r>
+        <w:t>truyền</w:t>
+      </w:r>
+      <w:r>
+        <w:t xml:space="preserve"> trong hệ thống mạng. </w:t>
+      </w:r>
+      <w:r>
+        <w:t xml:space="preserve">RYU </w:t>
+      </w:r>
+      <w:r>
+        <w:rPr>
+          <w:lang w:val="en-US"/>
+        </w:rPr>
+        <w:t>Controller</w:t>
+      </w:r>
+      <w:r>
+        <w:t xml:space="preserve"> </w:t>
+      </w:r>
+      <w:r>
+        <w:t>hoạt</w:t>
+      </w:r>
+      <w:r>
+        <w:t xml:space="preserve"> động ở </w:t>
+      </w:r>
+      <w:r>
+        <w:rPr>
+          <w:lang w:val="en-US"/>
+        </w:rPr>
+        <w:t>Control Plane</w:t>
+      </w:r>
+      <w:r>
+        <w:t xml:space="preserve"> và </w:t>
+      </w:r>
+      <w:r>
+        <w:t xml:space="preserve">có một số tính </w:t>
+      </w:r>
+      <w:r>
+        <w:t>chất</w:t>
+      </w:r>
+      <w:r>
+        <w:t xml:space="preserve"> sau:</w:t>
+      </w:r>
+    </w:p>
+    <w:p>
+      <w:pPr>
+        <w:pStyle w:val="oancuaDanhsach"/>
+        <w:numPr>
+          <w:ilvl w:val="0"/>
+          <w:numId w:val="18"/>
+        </w:numPr>
+      </w:pPr>
+      <w:r>
+        <w:t xml:space="preserve">Tính </w:t>
+      </w:r>
+      <w:r>
+        <w:t xml:space="preserve">linh động: Toàn bộ </w:t>
+      </w:r>
+      <w:r>
+        <w:t>các</w:t>
+      </w:r>
+      <w:r>
+        <w:t xml:space="preserve"> </w:t>
+      </w:r>
+      <w:r>
+        <w:t>hoạt</w:t>
+      </w:r>
+      <w:r>
+        <w:t xml:space="preserve"> động </w:t>
+      </w:r>
+      <w:r>
+        <w:t xml:space="preserve">của </w:t>
+      </w:r>
+      <w:r>
+        <w:t>các</w:t>
+      </w:r>
+      <w:r>
+        <w:t xml:space="preserve"> </w:t>
+      </w:r>
+      <w:r>
+        <w:t>thiết</w:t>
+      </w:r>
+      <w:r>
+        <w:t xml:space="preserve"> bị mạng đều </w:t>
+      </w:r>
+      <w:r>
+        <w:t>được</w:t>
+      </w:r>
+      <w:r>
+        <w:t xml:space="preserve"> kiểm </w:t>
+      </w:r>
+      <w:r>
+        <w:t>soát</w:t>
+      </w:r>
+      <w:r>
+        <w:t xml:space="preserve"> bởi </w:t>
+      </w:r>
+      <w:r>
+        <w:t>Controller</w:t>
+      </w:r>
+      <w:r>
+        <w:t xml:space="preserve">, </w:t>
+      </w:r>
+      <w:r>
+        <w:t>giúp</w:t>
+      </w:r>
+      <w:r>
+        <w:t xml:space="preserve"> quá trình </w:t>
+      </w:r>
+      <w:r>
+        <w:t>hoạt</w:t>
+      </w:r>
+      <w:r>
+        <w:t xml:space="preserve"> động của </w:t>
+      </w:r>
+      <w:r>
+        <w:t>các</w:t>
+      </w:r>
+      <w:r>
+        <w:t xml:space="preserve"> </w:t>
+      </w:r>
+      <w:r>
+        <w:t>thiết</w:t>
+      </w:r>
+      <w:r>
+        <w:t xml:space="preserve"> bị mạng trở nên </w:t>
+      </w:r>
+      <w:r>
+        <w:t xml:space="preserve">thông </w:t>
+      </w:r>
+      <w:r>
+        <w:t>suốt</w:t>
+      </w:r>
+      <w:r>
+        <w:t xml:space="preserve"> </w:t>
+      </w:r>
+      <w:r>
+        <w:t>hơn.</w:t>
+      </w:r>
+    </w:p>
+    <w:p>
+      <w:pPr>
+        <w:pStyle w:val="oancuaDanhsach"/>
+        <w:numPr>
+          <w:ilvl w:val="0"/>
+          <w:numId w:val="18"/>
+        </w:numPr>
+      </w:pPr>
+      <w:r>
+        <w:t xml:space="preserve">Tính tối giản: Với sự kiểm </w:t>
+      </w:r>
+      <w:r>
+        <w:t>soát</w:t>
+      </w:r>
+      <w:r>
+        <w:t xml:space="preserve"> của </w:t>
+      </w:r>
+      <w:r>
+        <w:t>Controller</w:t>
+      </w:r>
+      <w:r>
+        <w:t xml:space="preserve">, </w:t>
+      </w:r>
+      <w:r>
+        <w:t>các</w:t>
+      </w:r>
+      <w:r>
+        <w:t xml:space="preserve"> </w:t>
+      </w:r>
+      <w:r>
+        <w:t>thiết</w:t>
+      </w:r>
+      <w:r>
+        <w:t xml:space="preserve"> bị mạng chỉ cần </w:t>
+      </w:r>
+      <w:r>
+        <w:t>thực</w:t>
+      </w:r>
+      <w:r>
+        <w:t xml:space="preserve"> hiện theo cấu </w:t>
+      </w:r>
+      <w:r>
+        <w:t>hình</w:t>
+      </w:r>
+      <w:r>
+        <w:t xml:space="preserve"> và quy trình có sẵn, </w:t>
+      </w:r>
+      <w:r>
+        <w:t>giúp</w:t>
+      </w:r>
+      <w:r>
+        <w:t xml:space="preserve"> giảm thiểu sai </w:t>
+      </w:r>
+      <w:r>
+        <w:t>sót</w:t>
+      </w:r>
+      <w:r>
+        <w:t xml:space="preserve"> và tăng tính hiệu </w:t>
+      </w:r>
+      <w:r>
+        <w:t>quả</w:t>
+      </w:r>
+      <w:r>
+        <w:t xml:space="preserve"> cho toàn bộ hệ thống mạng.</w:t>
+      </w:r>
+    </w:p>
+    <w:p>
+      <w:pPr>
+        <w:ind w:firstLine="360"/>
+      </w:pPr>
+      <w:r>
+        <w:t xml:space="preserve">RYU </w:t>
+      </w:r>
+      <w:r>
+        <w:t>Controller</w:t>
+      </w:r>
+      <w:r>
+        <w:t xml:space="preserve"> tương </w:t>
+      </w:r>
+      <w:r>
+        <w:t>thích</w:t>
+      </w:r>
+      <w:r>
+        <w:t xml:space="preserve"> với chuẩn </w:t>
+      </w:r>
+      <w:r>
+        <w:t>OpenFlow</w:t>
+      </w:r>
+      <w:r>
+        <w:t xml:space="preserve">, do đó </w:t>
+      </w:r>
+      <w:r>
+        <w:t>thích</w:t>
+      </w:r>
+      <w:r>
+        <w:t xml:space="preserve"> </w:t>
+      </w:r>
+      <w:r>
+        <w:t>hợp</w:t>
+      </w:r>
+      <w:r>
+        <w:t xml:space="preserve"> để cài </w:t>
+      </w:r>
+      <w:r>
+        <w:t>đặt</w:t>
+      </w:r>
+      <w:r>
+        <w:t xml:space="preserve"> và cấu </w:t>
+      </w:r>
+      <w:r>
+        <w:t>hình</w:t>
+      </w:r>
+      <w:r>
+        <w:t xml:space="preserve"> trên </w:t>
+      </w:r>
+      <w:r>
+        <w:t>các</w:t>
+      </w:r>
+      <w:r>
+        <w:t xml:space="preserve"> hệ điều hành mạng </w:t>
+      </w:r>
+      <w:r>
+        <w:t>khác</w:t>
+      </w:r>
+      <w:r>
+        <w:t xml:space="preserve"> nhau. Trong phần báo cáo này, nhóm sẽ sử dụng </w:t>
+      </w:r>
+      <w:r>
+        <w:t xml:space="preserve">RYU </w:t>
+      </w:r>
+      <w:r>
+        <w:t>Controller</w:t>
+      </w:r>
+      <w:r>
+        <w:t xml:space="preserve"> </w:t>
+      </w:r>
+      <w:r>
+        <w:t>kết</w:t>
+      </w:r>
+      <w:r>
+        <w:t xml:space="preserve"> </w:t>
+      </w:r>
+      <w:r>
+        <w:t>hợp</w:t>
+      </w:r>
+      <w:r>
+        <w:t xml:space="preserve"> với </w:t>
+      </w:r>
+      <w:r>
+        <w:t>các</w:t>
+      </w:r>
+      <w:r>
+        <w:t xml:space="preserve"> thông số kỹ </w:t>
+      </w:r>
+      <w:r>
+        <w:t>thuật</w:t>
+      </w:r>
+      <w:r>
+        <w:t xml:space="preserve"> </w:t>
+      </w:r>
+      <w:r>
+        <w:t xml:space="preserve">sau để cài </w:t>
+      </w:r>
+      <w:r>
+        <w:t>đặt</w:t>
+      </w:r>
+      <w:r>
+        <w:t xml:space="preserve"> </w:t>
+      </w:r>
+      <w:r>
+        <w:t>thuật</w:t>
+      </w:r>
+      <w:r>
+        <w:t xml:space="preserve"> toán tìm đường đi ngắn nhất giữa </w:t>
+      </w:r>
+      <w:r>
+        <w:t>các</w:t>
+      </w:r>
+      <w:r>
+        <w:t xml:space="preserve"> </w:t>
+      </w:r>
+      <w:r>
+        <w:t>switch</w:t>
+      </w:r>
+      <w:r>
+        <w:t>:</w:t>
+      </w:r>
+    </w:p>
+    <w:p>
+      <w:pPr>
+        <w:pStyle w:val="oancuaDanhsach"/>
+        <w:numPr>
+          <w:ilvl w:val="0"/>
+          <w:numId w:val="18"/>
+        </w:numPr>
+      </w:pPr>
+      <w:r>
+        <w:rPr>
+          <w:lang w:val="en-US"/>
+        </w:rPr>
+        <w:t xml:space="preserve">Network OS – </w:t>
+      </w:r>
+      <w:r>
+        <w:t xml:space="preserve">Hệ điều hành Mạng: </w:t>
+      </w:r>
+      <w:r>
+        <w:rPr>
+          <w:lang w:val="en-US"/>
+        </w:rPr>
+        <w:t>Mininet</w:t>
+      </w:r>
+    </w:p>
+    <w:p>
+      <w:pPr>
+        <w:pStyle w:val="oancuaDanhsach"/>
+        <w:numPr>
+          <w:ilvl w:val="0"/>
+          <w:numId w:val="18"/>
+        </w:numPr>
+      </w:pPr>
+      <w:r>
+        <w:t>Host</w:t>
+      </w:r>
+      <w:r>
+        <w:t xml:space="preserve"> OS</w:t>
+      </w:r>
+      <w:r>
+        <w:t xml:space="preserve"> – </w:t>
+      </w:r>
+      <w:r>
+        <w:t xml:space="preserve">Hệ điều hành </w:t>
+      </w:r>
+      <w:r>
+        <w:t>kết</w:t>
+      </w:r>
+      <w:r>
+        <w:t xml:space="preserve"> nối: </w:t>
+      </w:r>
+      <w:r>
+        <w:t xml:space="preserve">Ubuntu 20.04 </w:t>
+      </w:r>
+      <w:r>
+        <w:t>Focal Fossa.</w:t>
+      </w:r>
+    </w:p>
+    <w:p>
+      <w:pPr>
+        <w:pStyle w:val="oancuaDanhsach"/>
+        <w:numPr>
+          <w:ilvl w:val="0"/>
+          <w:numId w:val="18"/>
+        </w:numPr>
+      </w:pPr>
+      <w:r>
+        <w:t>Ngôn ngữ lập trình chủ yếu:</w:t>
+      </w:r>
+      <w:r>
+        <w:t xml:space="preserve"> Python</w:t>
+      </w:r>
+    </w:p>
+    <w:p>
+      <w:pPr>
+        <w:pStyle w:val="oancuaDanhsach"/>
+        <w:numPr>
+          <w:ilvl w:val="0"/>
+          <w:numId w:val="18"/>
+        </w:numPr>
+        <w:rPr>
+          <w:lang w:val="en-US"/>
+        </w:rPr>
+      </w:pPr>
+      <w:r>
+        <w:t xml:space="preserve">Chuẩn </w:t>
+      </w:r>
+      <w:r>
+        <w:rPr>
+          <w:lang w:val="en-US"/>
+        </w:rPr>
+        <w:t>OpenFlow</w:t>
+      </w:r>
+      <w:r>
+        <w:t xml:space="preserve">: </w:t>
+      </w:r>
+      <w:r>
+        <w:rPr>
+          <w:lang w:val="en-US"/>
+        </w:rPr>
+        <w:t>OpenFlow 1.3</w:t>
+      </w:r>
+    </w:p>
+    <w:p>
+      <w:pPr>
+        <w:pStyle w:val="oancuaDanhsach"/>
+        <w:numPr>
+          <w:ilvl w:val="0"/>
+          <w:numId w:val="18"/>
+        </w:numPr>
+      </w:pPr>
+      <w:r>
+        <w:t>Phần mềm xây dựng sơ đồ mạng (</w:t>
+      </w:r>
+      <w:r>
+        <w:rPr>
+          <w:lang w:val="en-US"/>
+        </w:rPr>
+        <w:t>T</w:t>
+      </w:r>
+      <w:r>
+        <w:rPr>
+          <w:lang w:val="en-US"/>
+        </w:rPr>
+        <w:t>opology</w:t>
+      </w:r>
+      <w:r>
+        <w:t>)</w:t>
+      </w:r>
+      <w:r>
+        <w:t xml:space="preserve">: </w:t>
+      </w:r>
+      <w:r>
+        <w:rPr>
+          <w:lang w:val="en-US"/>
+        </w:rPr>
+        <w:t>MiniEdit</w:t>
+      </w:r>
+    </w:p>
+    <w:p>
+      <w:pPr>
+        <w:pStyle w:val="oancuaDanhsach"/>
+        <w:numPr>
+          <w:ilvl w:val="0"/>
+          <w:numId w:val="18"/>
+        </w:numPr>
+        <w:rPr>
+          <w:lang w:val="en-US"/>
+        </w:rPr>
+      </w:pPr>
+      <w:r>
+        <w:rPr>
+          <w:lang w:val="en-US"/>
+        </w:rPr>
+        <w:t xml:space="preserve">IDE </w:t>
+      </w:r>
+      <w:r>
+        <w:t xml:space="preserve">cài </w:t>
+      </w:r>
+      <w:r>
+        <w:t>đặt</w:t>
+      </w:r>
+      <w:r>
+        <w:t xml:space="preserve"> </w:t>
+      </w:r>
+      <w:r>
+        <w:t>thuật</w:t>
+      </w:r>
+      <w:r>
+        <w:t xml:space="preserve"> </w:t>
+      </w:r>
+      <w:r>
+        <w:t xml:space="preserve">toán: </w:t>
+      </w:r>
+      <w:r>
+        <w:rPr>
+          <w:lang w:val="en-US"/>
+        </w:rPr>
+        <w:t>VIM</w:t>
+      </w:r>
+    </w:p>
+    <w:p>
+      <w:pPr>
+        <w:spacing w:line="259" w:lineRule="auto"/>
+        <w:rPr>
+          <w:lang w:val="en-US"/>
+        </w:rPr>
+      </w:pPr>
+      <w:r>
+        <w:rPr>
+          <w:lang w:val="en-US"/>
+        </w:rPr>
+        <w:br w:type="page"/>
+      </w:r>
+    </w:p>
+    <w:p>
+      <w:pPr>
+        <w:rPr>
+          <w:lang w:val="en-US"/>
+        </w:rPr>
+      </w:pPr>
+    </w:p>
+    <w:p>
+      <w:pPr>
         <w:rPr>
           <w:rFonts w:eastAsiaTheme="majorEastAsia" w:cstheme="majorBidi"/>
           <w:b/>
@@ -1138,20 +1663,6 @@
         </w:rPr>
       </w:pPr>
       <w:r>
-        <w:br w:type="page"/>
-      </w:r>
-    </w:p>
-    <w:p>
-      <w:pPr>
-        <w:rPr>
-          <w:rFonts w:eastAsiaTheme="majorEastAsia" w:cstheme="majorBidi"/>
-          <w:b/>
-          <w:sz w:val="32"/>
-          <w:szCs w:val="32"/>
-        </w:rPr>
-      </w:pPr>
-      <w:r>
-        <w:lastRenderedPageBreak/>
         <w:br w:type="page"/>
       </w:r>
     </w:p>
@@ -1162,8 +1673,1714 @@
           <w:ilvl w:val="0"/>
           <w:numId w:val="16"/>
         </w:numPr>
+      </w:pPr>
+      <w:bookmarkStart w:id="1" w:name="_Toc90189584"/>
+      <w:r>
+        <w:lastRenderedPageBreak/>
+        <w:t xml:space="preserve">TÌM ĐƯỜNG ĐI NGẮN NHẤT </w:t>
+      </w:r>
+      <w:r>
+        <w:t>VỚI</w:t>
+      </w:r>
+      <w:r>
+        <w:t xml:space="preserve"> RYU CONTROLLER</w:t>
+      </w:r>
+      <w:bookmarkEnd w:id="1"/>
+    </w:p>
+    <w:p>
+      <w:r>
+        <w:rPr>
+          <w:noProof/>
+        </w:rPr>
+        <w:drawing>
+          <wp:anchor distT="0" distB="0" distL="114300" distR="114300" simplePos="0" relativeHeight="251660288" behindDoc="1" locked="0" layoutInCell="1" allowOverlap="1" wp14:anchorId="028E77EA" wp14:editId="44CBFEA6">
+            <wp:simplePos x="0" y="0"/>
+            <wp:positionH relativeFrom="column">
+              <wp:posOffset>-10795</wp:posOffset>
+            </wp:positionH>
+            <wp:positionV relativeFrom="paragraph">
+              <wp:posOffset>211455</wp:posOffset>
+            </wp:positionV>
+            <wp:extent cx="5602605" cy="4524375"/>
+            <wp:effectExtent l="0" t="0" r="0" b="9525"/>
+            <wp:wrapTight wrapText="bothSides">
+              <wp:wrapPolygon edited="0">
+                <wp:start x="0" y="0"/>
+                <wp:lineTo x="0" y="21555"/>
+                <wp:lineTo x="21519" y="21555"/>
+                <wp:lineTo x="21519" y="0"/>
+                <wp:lineTo x="0" y="0"/>
+              </wp:wrapPolygon>
+            </wp:wrapTight>
+            <wp:docPr id="3" name="Hình ảnh 3"/>
+            <wp:cNvGraphicFramePr>
+              <a:graphicFrameLocks xmlns:a="http://schemas.openxmlformats.org/drawingml/2006/main" noChangeAspect="1"/>
+            </wp:cNvGraphicFramePr>
+            <a:graphic xmlns:a="http://schemas.openxmlformats.org/drawingml/2006/main">
+              <a:graphicData uri="http://schemas.openxmlformats.org/drawingml/2006/picture">
+                <pic:pic xmlns:pic="http://schemas.openxmlformats.org/drawingml/2006/picture">
+                  <pic:nvPicPr>
+                    <pic:cNvPr id="1" name=""/>
+                    <pic:cNvPicPr/>
+                  </pic:nvPicPr>
+                  <pic:blipFill>
+                    <a:blip r:embed="rId15">
+                      <a:extLst>
+                        <a:ext uri="{28A0092B-C50C-407E-A947-70E740481C1C}">
+                          <a14:useLocalDpi xmlns:a14="http://schemas.microsoft.com/office/drawing/2010/main" val="0"/>
+                        </a:ext>
+                      </a:extLst>
+                    </a:blip>
+                    <a:stretch>
+                      <a:fillRect/>
+                    </a:stretch>
+                  </pic:blipFill>
+                  <pic:spPr>
+                    <a:xfrm>
+                      <a:off x="0" y="0"/>
+                      <a:ext cx="5602605" cy="4524375"/>
+                    </a:xfrm>
+                    <a:prstGeom prst="rect">
+                      <a:avLst/>
+                    </a:prstGeom>
+                  </pic:spPr>
+                </pic:pic>
+              </a:graphicData>
+            </a:graphic>
+            <wp14:sizeRelH relativeFrom="margin">
+              <wp14:pctWidth>0</wp14:pctWidth>
+            </wp14:sizeRelH>
+            <wp14:sizeRelV relativeFrom="margin">
+              <wp14:pctHeight>0</wp14:pctHeight>
+            </wp14:sizeRelV>
+          </wp:anchor>
+        </w:drawing>
+      </w:r>
+      <w:r>
+        <w:t>Nhóm</w:t>
+      </w:r>
+      <w:r>
+        <w:t xml:space="preserve"> tiến hành cài </w:t>
+      </w:r>
+      <w:r>
+        <w:t>đặt</w:t>
+      </w:r>
+      <w:r>
+        <w:t xml:space="preserve"> </w:t>
+      </w:r>
+      <w:r>
+        <w:t>thuật</w:t>
+      </w:r>
+      <w:r>
+        <w:t xml:space="preserve"> toán </w:t>
+      </w:r>
+      <w:r>
+        <w:t>Dijkstra</w:t>
+      </w:r>
+      <w:r>
+        <w:t xml:space="preserve"> </w:t>
+      </w:r>
+      <w:r>
+        <w:t xml:space="preserve">cho </w:t>
+      </w:r>
+      <w:r>
+        <w:t>hệ thống mạng sau đây:</w:t>
+      </w:r>
+    </w:p>
+    <w:p>
+      <w:pPr>
+        <w:spacing w:line="259" w:lineRule="auto"/>
+      </w:pPr>
+      <w:r>
+        <w:br w:type="page"/>
+      </w:r>
+    </w:p>
+    <w:p>
+      <w:pPr>
+        <w:rPr>
+          <w:b/>
+          <w:bCs/>
+          <w:i/>
+          <w:iCs/>
+        </w:rPr>
+      </w:pPr>
+      <w:r>
+        <w:rPr>
+          <w:b/>
+          <w:bCs/>
+          <w:i/>
+          <w:iCs/>
+          <w:noProof/>
+        </w:rPr>
+        <w:lastRenderedPageBreak/>
+        <w:drawing>
+          <wp:anchor distT="0" distB="0" distL="114300" distR="114300" simplePos="0" relativeHeight="251663360" behindDoc="1" locked="0" layoutInCell="1" allowOverlap="1" wp14:anchorId="4C74658A" wp14:editId="4E9CA71A">
+            <wp:simplePos x="0" y="0"/>
+            <wp:positionH relativeFrom="column">
+              <wp:posOffset>-3175</wp:posOffset>
+            </wp:positionH>
+            <wp:positionV relativeFrom="paragraph">
+              <wp:posOffset>320040</wp:posOffset>
+            </wp:positionV>
+            <wp:extent cx="3209925" cy="2524125"/>
+            <wp:effectExtent l="0" t="0" r="9525" b="9525"/>
+            <wp:wrapTight wrapText="bothSides">
+              <wp:wrapPolygon edited="0">
+                <wp:start x="0" y="0"/>
+                <wp:lineTo x="0" y="21518"/>
+                <wp:lineTo x="21536" y="21518"/>
+                <wp:lineTo x="21536" y="0"/>
+                <wp:lineTo x="0" y="0"/>
+              </wp:wrapPolygon>
+            </wp:wrapTight>
+            <wp:docPr id="5" name="Hình ảnh 5" descr="Ảnh có chứa văn bản&#10;&#10;Mô tả được tạo tự động"/>
+            <wp:cNvGraphicFramePr>
+              <a:graphicFrameLocks xmlns:a="http://schemas.openxmlformats.org/drawingml/2006/main" noChangeAspect="1"/>
+            </wp:cNvGraphicFramePr>
+            <a:graphic xmlns:a="http://schemas.openxmlformats.org/drawingml/2006/main">
+              <a:graphicData uri="http://schemas.openxmlformats.org/drawingml/2006/picture">
+                <pic:pic xmlns:pic="http://schemas.openxmlformats.org/drawingml/2006/picture">
+                  <pic:nvPicPr>
+                    <pic:cNvPr id="5" name="Hình ảnh 5" descr="Ảnh có chứa văn bản&#10;&#10;Mô tả được tạo tự động"/>
+                    <pic:cNvPicPr/>
+                  </pic:nvPicPr>
+                  <pic:blipFill>
+                    <a:blip r:embed="rId16">
+                      <a:extLst>
+                        <a:ext uri="{28A0092B-C50C-407E-A947-70E740481C1C}">
+                          <a14:useLocalDpi xmlns:a14="http://schemas.microsoft.com/office/drawing/2010/main" val="0"/>
+                        </a:ext>
+                      </a:extLst>
+                    </a:blip>
+                    <a:stretch>
+                      <a:fillRect/>
+                    </a:stretch>
+                  </pic:blipFill>
+                  <pic:spPr>
+                    <a:xfrm>
+                      <a:off x="0" y="0"/>
+                      <a:ext cx="3209925" cy="2524125"/>
+                    </a:xfrm>
+                    <a:prstGeom prst="rect">
+                      <a:avLst/>
+                    </a:prstGeom>
+                  </pic:spPr>
+                </pic:pic>
+              </a:graphicData>
+            </a:graphic>
+          </wp:anchor>
+        </w:drawing>
+      </w:r>
+      <w:r>
+        <w:rPr>
+          <w:b/>
+          <w:bCs/>
+          <w:i/>
+          <w:iCs/>
+        </w:rPr>
+        <w:t xml:space="preserve">Phần </w:t>
+      </w:r>
+      <w:r>
+        <w:rPr>
+          <w:b/>
+          <w:bCs/>
+          <w:i/>
+          <w:iCs/>
+        </w:rPr>
+        <w:t xml:space="preserve">cấu </w:t>
+      </w:r>
+      <w:r>
+        <w:rPr>
+          <w:b/>
+          <w:bCs/>
+          <w:i/>
+          <w:iCs/>
+        </w:rPr>
+        <w:t>hình</w:t>
+      </w:r>
+      <w:r>
+        <w:rPr>
+          <w:b/>
+          <w:bCs/>
+          <w:i/>
+          <w:iCs/>
+        </w:rPr>
+        <w:t xml:space="preserve"> </w:t>
+      </w:r>
+      <w:r>
+        <w:rPr>
+          <w:b/>
+          <w:bCs/>
+          <w:i/>
+          <w:iCs/>
+        </w:rPr>
+        <w:t>thuật</w:t>
+      </w:r>
+      <w:r>
+        <w:rPr>
+          <w:b/>
+          <w:bCs/>
+          <w:i/>
+          <w:iCs/>
+        </w:rPr>
+        <w:t xml:space="preserve"> </w:t>
+      </w:r>
+      <w:r>
+        <w:rPr>
+          <w:b/>
+          <w:bCs/>
+          <w:i/>
+          <w:iCs/>
+        </w:rPr>
+        <w:t>toán:</w:t>
+      </w:r>
+      <w:r>
+        <w:rPr>
+          <w:noProof/>
+        </w:rPr>
+        <w:t xml:space="preserve"> </w:t>
+      </w:r>
+    </w:p>
+    <w:p/>
+    <w:p>
+      <w:pPr>
+        <w:spacing w:line="259" w:lineRule="auto"/>
+      </w:pPr>
+      <w:r>
+        <w:rPr>
+          <w:noProof/>
+        </w:rPr>
+        <w:drawing>
+          <wp:anchor distT="0" distB="0" distL="114300" distR="114300" simplePos="0" relativeHeight="251661312" behindDoc="1" locked="0" layoutInCell="1" allowOverlap="1" wp14:anchorId="64ABE493" wp14:editId="5D513D46">
+            <wp:simplePos x="0" y="0"/>
+            <wp:positionH relativeFrom="column">
+              <wp:posOffset>-3175</wp:posOffset>
+            </wp:positionH>
+            <wp:positionV relativeFrom="paragraph">
+              <wp:posOffset>2112645</wp:posOffset>
+            </wp:positionV>
+            <wp:extent cx="5349240" cy="5164455"/>
+            <wp:effectExtent l="0" t="0" r="3810" b="0"/>
+            <wp:wrapTight wrapText="bothSides">
+              <wp:wrapPolygon edited="0">
+                <wp:start x="0" y="0"/>
+                <wp:lineTo x="0" y="21512"/>
+                <wp:lineTo x="21538" y="21512"/>
+                <wp:lineTo x="21538" y="0"/>
+                <wp:lineTo x="0" y="0"/>
+              </wp:wrapPolygon>
+            </wp:wrapTight>
+            <wp:docPr id="2" name="Hình ảnh 2" descr="Ảnh có chứa văn bản&#10;&#10;Mô tả được tạo tự động"/>
+            <wp:cNvGraphicFramePr>
+              <a:graphicFrameLocks xmlns:a="http://schemas.openxmlformats.org/drawingml/2006/main" noChangeAspect="1"/>
+            </wp:cNvGraphicFramePr>
+            <a:graphic xmlns:a="http://schemas.openxmlformats.org/drawingml/2006/main">
+              <a:graphicData uri="http://schemas.openxmlformats.org/drawingml/2006/picture">
+                <pic:pic xmlns:pic="http://schemas.openxmlformats.org/drawingml/2006/picture">
+                  <pic:nvPicPr>
+                    <pic:cNvPr id="2" name="Hình ảnh 2" descr="Ảnh có chứa văn bản&#10;&#10;Mô tả được tạo tự động"/>
+                    <pic:cNvPicPr/>
+                  </pic:nvPicPr>
+                  <pic:blipFill>
+                    <a:blip r:embed="rId17">
+                      <a:extLst>
+                        <a:ext uri="{28A0092B-C50C-407E-A947-70E740481C1C}">
+                          <a14:useLocalDpi xmlns:a14="http://schemas.microsoft.com/office/drawing/2010/main" val="0"/>
+                        </a:ext>
+                      </a:extLst>
+                    </a:blip>
+                    <a:stretch>
+                      <a:fillRect/>
+                    </a:stretch>
+                  </pic:blipFill>
+                  <pic:spPr>
+                    <a:xfrm>
+                      <a:off x="0" y="0"/>
+                      <a:ext cx="5349240" cy="5164455"/>
+                    </a:xfrm>
+                    <a:prstGeom prst="rect">
+                      <a:avLst/>
+                    </a:prstGeom>
+                  </pic:spPr>
+                </pic:pic>
+              </a:graphicData>
+            </a:graphic>
+            <wp14:sizeRelH relativeFrom="margin">
+              <wp14:pctWidth>0</wp14:pctWidth>
+            </wp14:sizeRelH>
+            <wp14:sizeRelV relativeFrom="margin">
+              <wp14:pctHeight>0</wp14:pctHeight>
+            </wp14:sizeRelV>
+          </wp:anchor>
+        </w:drawing>
+      </w:r>
+      <w:r>
+        <w:br w:type="page"/>
+      </w:r>
+    </w:p>
+    <w:p>
+      <w:r>
+        <w:rPr>
+          <w:b/>
+          <w:bCs/>
+          <w:i/>
+          <w:iCs/>
+          <w:noProof/>
+        </w:rPr>
+        <w:lastRenderedPageBreak/>
+        <w:drawing>
+          <wp:anchor distT="0" distB="0" distL="114300" distR="114300" simplePos="0" relativeHeight="251662336" behindDoc="1" locked="0" layoutInCell="1" allowOverlap="1" wp14:anchorId="61D673BB" wp14:editId="3C235A57">
+            <wp:simplePos x="0" y="0"/>
+            <wp:positionH relativeFrom="column">
+              <wp:posOffset>133985</wp:posOffset>
+            </wp:positionH>
+            <wp:positionV relativeFrom="paragraph">
+              <wp:posOffset>0</wp:posOffset>
+            </wp:positionV>
+            <wp:extent cx="5234940" cy="6313762"/>
+            <wp:effectExtent l="0" t="0" r="3810" b="0"/>
+            <wp:wrapTight wrapText="bothSides">
+              <wp:wrapPolygon edited="0">
+                <wp:start x="0" y="0"/>
+                <wp:lineTo x="0" y="21509"/>
+                <wp:lineTo x="21537" y="21509"/>
+                <wp:lineTo x="21537" y="0"/>
+                <wp:lineTo x="0" y="0"/>
+              </wp:wrapPolygon>
+            </wp:wrapTight>
+            <wp:docPr id="4" name="Hình ảnh 4" descr="Ảnh có chứa văn bản&#10;&#10;Mô tả được tạo tự động"/>
+            <wp:cNvGraphicFramePr>
+              <a:graphicFrameLocks xmlns:a="http://schemas.openxmlformats.org/drawingml/2006/main" noChangeAspect="1"/>
+            </wp:cNvGraphicFramePr>
+            <a:graphic xmlns:a="http://schemas.openxmlformats.org/drawingml/2006/main">
+              <a:graphicData uri="http://schemas.openxmlformats.org/drawingml/2006/picture">
+                <pic:pic xmlns:pic="http://schemas.openxmlformats.org/drawingml/2006/picture">
+                  <pic:nvPicPr>
+                    <pic:cNvPr id="4" name="Hình ảnh 4" descr="Ảnh có chứa văn bản&#10;&#10;Mô tả được tạo tự động"/>
+                    <pic:cNvPicPr/>
+                  </pic:nvPicPr>
+                  <pic:blipFill>
+                    <a:blip r:embed="rId18">
+                      <a:extLst>
+                        <a:ext uri="{28A0092B-C50C-407E-A947-70E740481C1C}">
+                          <a14:useLocalDpi xmlns:a14="http://schemas.microsoft.com/office/drawing/2010/main" val="0"/>
+                        </a:ext>
+                      </a:extLst>
+                    </a:blip>
+                    <a:stretch>
+                      <a:fillRect/>
+                    </a:stretch>
+                  </pic:blipFill>
+                  <pic:spPr>
+                    <a:xfrm>
+                      <a:off x="0" y="0"/>
+                      <a:ext cx="5234940" cy="6313762"/>
+                    </a:xfrm>
+                    <a:prstGeom prst="rect">
+                      <a:avLst/>
+                    </a:prstGeom>
+                  </pic:spPr>
+                </pic:pic>
+              </a:graphicData>
+            </a:graphic>
+          </wp:anchor>
+        </w:drawing>
+      </w:r>
+      <w:r>
+        <w:rPr>
+          <w:b/>
+          <w:bCs/>
+          <w:i/>
+          <w:iCs/>
+        </w:rPr>
+        <w:t xml:space="preserve">Giải </w:t>
+      </w:r>
+      <w:r>
+        <w:rPr>
+          <w:b/>
+          <w:bCs/>
+          <w:i/>
+          <w:iCs/>
+        </w:rPr>
+        <w:t>thích</w:t>
+      </w:r>
+      <w:r>
+        <w:rPr>
+          <w:b/>
+          <w:bCs/>
+          <w:i/>
+          <w:iCs/>
+        </w:rPr>
+        <w:t xml:space="preserve"> </w:t>
+      </w:r>
+      <w:r>
+        <w:rPr>
+          <w:b/>
+          <w:bCs/>
+          <w:i/>
+          <w:iCs/>
+        </w:rPr>
+        <w:t>thuật</w:t>
+      </w:r>
+      <w:r>
+        <w:rPr>
+          <w:b/>
+          <w:bCs/>
+          <w:i/>
+          <w:iCs/>
+        </w:rPr>
+        <w:t xml:space="preserve"> toán</w:t>
+      </w:r>
+      <w:r>
+        <w:t>:</w:t>
+      </w:r>
+    </w:p>
+    <w:p>
+      <w:pPr>
+        <w:pStyle w:val="oancuaDanhsach"/>
+        <w:numPr>
+          <w:ilvl w:val="0"/>
+          <w:numId w:val="18"/>
+        </w:numPr>
+      </w:pPr>
+      <w:r>
+        <w:t>Tại</w:t>
+      </w:r>
+      <w:r>
+        <w:t xml:space="preserve"> hàm này, đầu tiên ta tạo hai biến lưu dạng dict là </w:t>
+      </w:r>
+      <w:r>
+        <w:rPr>
+          <w:b/>
+          <w:bCs/>
+        </w:rPr>
+        <w:t>previous</w:t>
+      </w:r>
+      <w:r>
+        <w:t xml:space="preserve"> (lưu giá trị node liền kề, cụ thể ở đây là </w:t>
+      </w:r>
+      <w:r>
+        <w:rPr>
+          <w:b/>
+          <w:bCs/>
+        </w:rPr>
+        <w:t>OpenFlow switch</w:t>
+      </w:r>
+      <w:r>
+        <w:t>)</w:t>
+      </w:r>
+      <w:r>
+        <w:t xml:space="preserve"> và </w:t>
+      </w:r>
+      <w:r>
+        <w:rPr>
+          <w:b/>
+          <w:bCs/>
+        </w:rPr>
+        <w:t>distance</w:t>
+      </w:r>
+      <w:r>
+        <w:t xml:space="preserve"> </w:t>
+      </w:r>
+      <w:r>
+        <w:t xml:space="preserve">(lưu khoảng </w:t>
+      </w:r>
+      <w:r>
+        <w:t>cách</w:t>
+      </w:r>
+      <w:r>
+        <w:t xml:space="preserve"> giữa </w:t>
+      </w:r>
+      <w:r>
+        <w:t>các</w:t>
+      </w:r>
+      <w:r>
+        <w:t xml:space="preserve"> node với nhau)</w:t>
+      </w:r>
+    </w:p>
+    <w:p>
+      <w:pPr>
+        <w:pStyle w:val="oancuaDanhsach"/>
+        <w:numPr>
+          <w:ilvl w:val="0"/>
+          <w:numId w:val="18"/>
+        </w:numPr>
+      </w:pPr>
+      <w:r>
+        <w:t>Duyệt</w:t>
+      </w:r>
+      <w:r>
+        <w:t xml:space="preserve"> </w:t>
+      </w:r>
+      <w:r>
+        <w:t>thuật</w:t>
+      </w:r>
+      <w:r>
+        <w:t xml:space="preserve"> toán Dijkstra, với khoảng </w:t>
+      </w:r>
+      <w:r>
+        <w:t>cách</w:t>
+      </w:r>
+      <w:r>
+        <w:t xml:space="preserve"> giữa 2 node </w:t>
+      </w:r>
+      <w:r>
+        <w:t>liền kề</w:t>
+      </w:r>
+      <w:r>
+        <w:t xml:space="preserve"> là 1. Ta tìm vị </w:t>
+      </w:r>
+      <w:r>
+        <w:t>trí</w:t>
+      </w:r>
+      <w:r>
+        <w:t xml:space="preserve"> node có khoảng </w:t>
+      </w:r>
+      <w:r>
+        <w:t>cách</w:t>
+      </w:r>
+      <w:r>
+        <w:t xml:space="preserve"> ngắn nhất so với node liền kề. </w:t>
+      </w:r>
+      <w:r>
+        <w:t xml:space="preserve">Cộng khoảng </w:t>
+      </w:r>
+      <w:r>
+        <w:t>cách</w:t>
+      </w:r>
+      <w:r>
+        <w:t xml:space="preserve"> rồi s</w:t>
+      </w:r>
+      <w:r>
+        <w:t xml:space="preserve">o sánh khoảng </w:t>
+      </w:r>
+      <w:r>
+        <w:t>cách</w:t>
+      </w:r>
+      <w:r>
+        <w:t xml:space="preserve"> </w:t>
+      </w:r>
+      <w:r>
+        <w:t xml:space="preserve">mới </w:t>
+      </w:r>
+      <w:r>
+        <w:t xml:space="preserve">với khoảng </w:t>
+      </w:r>
+      <w:r>
+        <w:t>cách</w:t>
+      </w:r>
+      <w:r>
+        <w:t xml:space="preserve"> </w:t>
+      </w:r>
+      <w:r>
+        <w:t>trước</w:t>
+      </w:r>
+      <w:r>
+        <w:t xml:space="preserve"> đó</w:t>
+      </w:r>
+      <w:r>
+        <w:t xml:space="preserve">, nếu nhỏ hơn thì </w:t>
+      </w:r>
+      <w:r>
+        <w:t>xác</w:t>
+      </w:r>
+      <w:r>
+        <w:t xml:space="preserve"> định</w:t>
+      </w:r>
+      <w:r>
+        <w:t xml:space="preserve"> </w:t>
+      </w:r>
+      <w:r>
+        <w:lastRenderedPageBreak/>
+        <w:t xml:space="preserve">khoảng </w:t>
+      </w:r>
+      <w:r>
+        <w:t>cách</w:t>
+      </w:r>
+      <w:r>
+        <w:t xml:space="preserve"> mới</w:t>
+      </w:r>
+      <w:r>
+        <w:t xml:space="preserve">. </w:t>
+      </w:r>
+      <w:r>
+        <w:t xml:space="preserve">Lần </w:t>
+      </w:r>
+      <w:r>
+        <w:t>lượt</w:t>
+      </w:r>
+      <w:r>
+        <w:t xml:space="preserve"> làm như vậy cho đến khi </w:t>
+      </w:r>
+      <w:r>
+        <w:t>kết</w:t>
+      </w:r>
+      <w:r>
+        <w:t xml:space="preserve"> </w:t>
+      </w:r>
+      <w:r>
+        <w:t>thúc</w:t>
+      </w:r>
+      <w:r>
+        <w:t xml:space="preserve"> </w:t>
+      </w:r>
+      <w:r>
+        <w:t>thuật</w:t>
+      </w:r>
+      <w:r>
+        <w:t xml:space="preserve"> toán, tìm thấy </w:t>
+      </w:r>
+      <w:r>
+        <w:t>được</w:t>
+      </w:r>
+      <w:r>
+        <w:t xml:space="preserve"> đường đi ngắn nhất giữa </w:t>
+      </w:r>
+      <w:r>
+        <w:t>các</w:t>
+      </w:r>
+      <w:r>
+        <w:t xml:space="preserve"> node với nhau.</w:t>
+      </w:r>
+    </w:p>
+    <w:p>
+      <w:r>
+        <w:rPr>
+          <w:b/>
+          <w:bCs/>
+          <w:i/>
+          <w:iCs/>
+        </w:rPr>
+        <w:t>Đánh giá</w:t>
+      </w:r>
+      <w:r>
+        <w:rPr>
+          <w:b/>
+          <w:bCs/>
+          <w:i/>
+          <w:iCs/>
+        </w:rPr>
+        <w:t xml:space="preserve"> chung</w:t>
+      </w:r>
+      <w:r>
+        <w:t xml:space="preserve">: </w:t>
+      </w:r>
+    </w:p>
+    <w:p>
+      <w:pPr>
+        <w:pStyle w:val="oancuaDanhsach"/>
+        <w:numPr>
+          <w:ilvl w:val="0"/>
+          <w:numId w:val="18"/>
+        </w:numPr>
+        <w:rPr>
+          <w:i/>
+          <w:iCs/>
+        </w:rPr>
+      </w:pPr>
+      <w:r>
+        <w:rPr>
+          <w:i/>
+          <w:iCs/>
+        </w:rPr>
+        <w:t>Thuật</w:t>
+      </w:r>
+      <w:r>
+        <w:rPr>
+          <w:i/>
+          <w:iCs/>
+        </w:rPr>
+        <w:t xml:space="preserve"> toán này có </w:t>
+      </w:r>
+      <w:r>
+        <w:rPr>
+          <w:i/>
+          <w:iCs/>
+        </w:rPr>
+        <w:t xml:space="preserve">một tính </w:t>
+      </w:r>
+      <w:r>
+        <w:rPr>
+          <w:i/>
+          <w:iCs/>
+        </w:rPr>
+        <w:t>chất</w:t>
+      </w:r>
+      <w:r>
+        <w:rPr>
+          <w:i/>
+          <w:iCs/>
+        </w:rPr>
+        <w:t xml:space="preserve"> là </w:t>
+      </w:r>
+      <w:r>
+        <w:rPr>
+          <w:b/>
+          <w:bCs/>
+          <w:i/>
+          <w:iCs/>
+        </w:rPr>
+        <w:t>hội tụ chậm hơn</w:t>
+      </w:r>
+      <w:r>
+        <w:rPr>
+          <w:i/>
+          <w:iCs/>
+        </w:rPr>
+        <w:t xml:space="preserve"> so với một số </w:t>
+      </w:r>
+      <w:r>
+        <w:rPr>
+          <w:i/>
+          <w:iCs/>
+        </w:rPr>
+        <w:t>thuật</w:t>
+      </w:r>
+      <w:r>
+        <w:rPr>
+          <w:i/>
+          <w:iCs/>
+        </w:rPr>
+        <w:t xml:space="preserve"> toán </w:t>
+      </w:r>
+      <w:r>
+        <w:rPr>
+          <w:i/>
+          <w:iCs/>
+        </w:rPr>
+        <w:t>khắc</w:t>
+      </w:r>
+      <w:r>
+        <w:rPr>
+          <w:i/>
+          <w:iCs/>
+        </w:rPr>
+        <w:t xml:space="preserve"> và chỉ </w:t>
+      </w:r>
+      <w:r>
+        <w:rPr>
+          <w:i/>
+          <w:iCs/>
+        </w:rPr>
+        <w:t>thích</w:t>
+      </w:r>
+      <w:r>
+        <w:rPr>
+          <w:i/>
+          <w:iCs/>
+        </w:rPr>
+        <w:t xml:space="preserve"> </w:t>
+      </w:r>
+      <w:r>
+        <w:rPr>
+          <w:i/>
+          <w:iCs/>
+        </w:rPr>
+        <w:t>hợp</w:t>
+      </w:r>
+      <w:r>
+        <w:rPr>
+          <w:i/>
+          <w:iCs/>
+        </w:rPr>
+        <w:t xml:space="preserve"> với </w:t>
+      </w:r>
+      <w:r>
+        <w:rPr>
+          <w:b/>
+          <w:bCs/>
+          <w:i/>
+          <w:iCs/>
+        </w:rPr>
+        <w:t>đồ thị có trọng số dương</w:t>
+      </w:r>
+      <w:r>
+        <w:rPr>
+          <w:i/>
+          <w:iCs/>
+        </w:rPr>
+        <w:t xml:space="preserve">. Do đó khi cài </w:t>
+      </w:r>
+      <w:r>
+        <w:rPr>
+          <w:i/>
+          <w:iCs/>
+        </w:rPr>
+        <w:t>đặt</w:t>
+      </w:r>
+      <w:r>
+        <w:rPr>
+          <w:i/>
+          <w:iCs/>
+        </w:rPr>
+        <w:t xml:space="preserve"> </w:t>
+      </w:r>
+      <w:r>
+        <w:rPr>
+          <w:i/>
+          <w:iCs/>
+        </w:rPr>
+        <w:t>thuật</w:t>
+      </w:r>
+      <w:r>
+        <w:rPr>
+          <w:i/>
+          <w:iCs/>
+        </w:rPr>
+        <w:t xml:space="preserve"> toán này có thể sẽ xảy ra tình huống gói tin </w:t>
+      </w:r>
+      <w:r>
+        <w:rPr>
+          <w:i/>
+          <w:iCs/>
+        </w:rPr>
+        <w:t>được</w:t>
+      </w:r>
+      <w:r>
+        <w:rPr>
+          <w:i/>
+          <w:iCs/>
+        </w:rPr>
+        <w:t xml:space="preserve"> gửi từ host lên OpenFlow switch nhưng switch không thể </w:t>
+      </w:r>
+      <w:r>
+        <w:rPr>
+          <w:i/>
+          <w:iCs/>
+        </w:rPr>
+        <w:t xml:space="preserve">chọn </w:t>
+      </w:r>
+      <w:r>
+        <w:rPr>
+          <w:i/>
+          <w:iCs/>
+        </w:rPr>
+        <w:t>được</w:t>
+      </w:r>
+      <w:r>
+        <w:rPr>
+          <w:i/>
+          <w:iCs/>
+        </w:rPr>
+        <w:t xml:space="preserve"> đường đi</w:t>
+      </w:r>
+      <w:r>
+        <w:rPr>
+          <w:i/>
+          <w:iCs/>
+        </w:rPr>
+        <w:t xml:space="preserve">, </w:t>
+      </w:r>
+      <w:r>
+        <w:rPr>
+          <w:i/>
+          <w:iCs/>
+        </w:rPr>
+        <w:t>buộc</w:t>
+      </w:r>
+      <w:r>
+        <w:rPr>
+          <w:i/>
+          <w:iCs/>
+        </w:rPr>
+        <w:t xml:space="preserve"> phải </w:t>
+      </w:r>
+      <w:r>
+        <w:rPr>
+          <w:i/>
+          <w:iCs/>
+        </w:rPr>
+        <w:t>đẩy</w:t>
+      </w:r>
+      <w:r>
+        <w:rPr>
+          <w:i/>
+          <w:iCs/>
+        </w:rPr>
+        <w:t xml:space="preserve"> gói tin</w:t>
+      </w:r>
+      <w:r>
+        <w:rPr>
+          <w:i/>
+          <w:iCs/>
+        </w:rPr>
+        <w:t xml:space="preserve"> lên controller và mất một khoảng thời gian để xây dựng đồ thị chính </w:t>
+      </w:r>
+      <w:r>
+        <w:rPr>
+          <w:i/>
+          <w:iCs/>
+        </w:rPr>
+        <w:t>xác</w:t>
+      </w:r>
+      <w:r>
+        <w:rPr>
+          <w:i/>
+          <w:iCs/>
+        </w:rPr>
+        <w:t>.</w:t>
+      </w:r>
+      <w:r>
+        <w:rPr>
+          <w:i/>
+          <w:iCs/>
+        </w:rPr>
+        <w:t xml:space="preserve"> </w:t>
+      </w:r>
+    </w:p>
+    <w:p>
+      <w:pPr>
+        <w:pStyle w:val="oancuaDanhsach"/>
+        <w:numPr>
+          <w:ilvl w:val="0"/>
+          <w:numId w:val="18"/>
+        </w:numPr>
+        <w:rPr>
+          <w:i/>
+          <w:iCs/>
+        </w:rPr>
+      </w:pPr>
+      <w:r>
+        <w:rPr>
+          <w:i/>
+          <w:iCs/>
+        </w:rPr>
+        <w:t xml:space="preserve">Như vậy, </w:t>
+      </w:r>
+      <w:r>
+        <w:rPr>
+          <w:i/>
+          <w:iCs/>
+        </w:rPr>
+        <w:t>rất</w:t>
+      </w:r>
+      <w:r>
+        <w:rPr>
+          <w:i/>
+          <w:iCs/>
+        </w:rPr>
+        <w:t xml:space="preserve"> có thể gói tin sẽ bị đánh dấu là </w:t>
+      </w:r>
+      <w:r>
+        <w:rPr>
+          <w:b/>
+          <w:bCs/>
+          <w:i/>
+          <w:iCs/>
+        </w:rPr>
+        <w:t>Destination Host Unreachable</w:t>
+      </w:r>
+      <w:r>
+        <w:rPr>
+          <w:i/>
+          <w:iCs/>
+        </w:rPr>
+        <w:t xml:space="preserve"> </w:t>
+      </w:r>
+      <w:r>
+        <w:rPr>
+          <w:b/>
+          <w:bCs/>
+          <w:i/>
+          <w:iCs/>
+        </w:rPr>
+        <w:t xml:space="preserve">(Không đến được </w:t>
+      </w:r>
+      <w:r>
+        <w:rPr>
+          <w:b/>
+          <w:bCs/>
+          <w:i/>
+          <w:iCs/>
+        </w:rPr>
+        <w:t>điểm</w:t>
+      </w:r>
+      <w:r>
+        <w:rPr>
+          <w:b/>
+          <w:bCs/>
+          <w:i/>
+          <w:iCs/>
+        </w:rPr>
+        <w:t xml:space="preserve"> </w:t>
+      </w:r>
+      <w:r>
+        <w:rPr>
+          <w:b/>
+          <w:bCs/>
+          <w:i/>
+          <w:iCs/>
+        </w:rPr>
+        <w:t>đích</w:t>
+      </w:r>
+      <w:r>
+        <w:rPr>
+          <w:b/>
+          <w:bCs/>
+          <w:i/>
+          <w:iCs/>
+        </w:rPr>
+        <w:t>)</w:t>
+      </w:r>
+      <w:r>
+        <w:rPr>
+          <w:i/>
+          <w:iCs/>
+        </w:rPr>
+        <w:t xml:space="preserve"> do timeout.</w:t>
+      </w:r>
+      <w:r>
+        <w:rPr>
+          <w:i/>
+          <w:iCs/>
+        </w:rPr>
+        <w:t xml:space="preserve"> Tuy nhiên, </w:t>
+      </w:r>
+      <w:r>
+        <w:rPr>
+          <w:i/>
+          <w:iCs/>
+        </w:rPr>
+        <w:t>điểm</w:t>
+      </w:r>
+      <w:r>
+        <w:rPr>
+          <w:i/>
+          <w:iCs/>
+        </w:rPr>
+        <w:t xml:space="preserve"> yếu này </w:t>
+      </w:r>
+      <w:r>
+        <w:rPr>
+          <w:i/>
+          <w:iCs/>
+        </w:rPr>
+        <w:t xml:space="preserve">có thể </w:t>
+      </w:r>
+      <w:r>
+        <w:rPr>
+          <w:i/>
+          <w:iCs/>
+        </w:rPr>
+        <w:t xml:space="preserve">được </w:t>
+      </w:r>
+      <w:r>
+        <w:rPr>
+          <w:i/>
+          <w:iCs/>
+        </w:rPr>
+        <w:t>khắc</w:t>
+      </w:r>
+      <w:r>
+        <w:rPr>
+          <w:i/>
+          <w:iCs/>
+        </w:rPr>
+        <w:t xml:space="preserve"> phục bằng </w:t>
+      </w:r>
+      <w:r>
+        <w:rPr>
+          <w:i/>
+          <w:iCs/>
+        </w:rPr>
+        <w:t>cách</w:t>
+      </w:r>
+      <w:r>
+        <w:rPr>
+          <w:i/>
+          <w:iCs/>
+        </w:rPr>
+        <w:t xml:space="preserve"> khởi động lại Controller để </w:t>
+      </w:r>
+      <w:r>
+        <w:rPr>
+          <w:i/>
+          <w:iCs/>
+        </w:rPr>
+        <w:t>xử</w:t>
+      </w:r>
+      <w:r>
+        <w:rPr>
+          <w:i/>
+          <w:iCs/>
+        </w:rPr>
+        <w:t xml:space="preserve"> </w:t>
+      </w:r>
+      <w:r>
+        <w:rPr>
+          <w:i/>
+          <w:iCs/>
+        </w:rPr>
+        <w:t>lý</w:t>
+      </w:r>
+      <w:r>
+        <w:rPr>
+          <w:i/>
+          <w:iCs/>
+        </w:rPr>
+        <w:t>.</w:t>
+      </w:r>
+      <w:r>
+        <w:rPr>
+          <w:i/>
+          <w:iCs/>
+        </w:rPr>
+        <w:t xml:space="preserve"> Trong thời gian tới, nhóm có thể xem </w:t>
+      </w:r>
+      <w:r>
+        <w:rPr>
+          <w:i/>
+          <w:iCs/>
+        </w:rPr>
+        <w:t>xét</w:t>
+      </w:r>
+      <w:r>
+        <w:rPr>
+          <w:i/>
+          <w:iCs/>
+        </w:rPr>
+        <w:t xml:space="preserve"> cải tiến </w:t>
+      </w:r>
+      <w:r>
+        <w:rPr>
+          <w:i/>
+          <w:iCs/>
+        </w:rPr>
+        <w:t>thuật</w:t>
+      </w:r>
+      <w:r>
+        <w:rPr>
+          <w:i/>
+          <w:iCs/>
+        </w:rPr>
+        <w:t xml:space="preserve"> toán để tăng </w:t>
+      </w:r>
+      <w:r>
+        <w:rPr>
+          <w:i/>
+          <w:iCs/>
+        </w:rPr>
+        <w:t>tốc</w:t>
+      </w:r>
+      <w:r>
+        <w:rPr>
+          <w:i/>
+          <w:iCs/>
+        </w:rPr>
+        <w:t xml:space="preserve"> độ và </w:t>
+      </w:r>
+      <w:r>
+        <w:rPr>
+          <w:i/>
+          <w:iCs/>
+        </w:rPr>
+        <w:t>độ tối ưu cho controller.</w:t>
+      </w:r>
+    </w:p>
+    <w:p>
+      <w:r>
+        <w:rPr>
+          <w:b/>
+          <w:bCs/>
+          <w:i/>
+          <w:iCs/>
+        </w:rPr>
+        <w:t>Hình</w:t>
+      </w:r>
+      <w:r>
+        <w:rPr>
+          <w:b/>
+          <w:bCs/>
+          <w:i/>
+          <w:iCs/>
+        </w:rPr>
+        <w:t xml:space="preserve"> ảnh minh họa</w:t>
+      </w:r>
+      <w:r>
+        <w:rPr>
+          <w:b/>
+          <w:bCs/>
+          <w:i/>
+          <w:iCs/>
+        </w:rPr>
+        <w:t xml:space="preserve"> cho quá trình </w:t>
+      </w:r>
+      <w:r>
+        <w:rPr>
+          <w:b/>
+          <w:bCs/>
+          <w:i/>
+          <w:iCs/>
+        </w:rPr>
+        <w:t>thực</w:t>
+      </w:r>
+      <w:r>
+        <w:rPr>
+          <w:b/>
+          <w:bCs/>
+          <w:i/>
+          <w:iCs/>
+        </w:rPr>
+        <w:t xml:space="preserve"> hiện</w:t>
+      </w:r>
+      <w:r>
+        <w:t>:</w:t>
+      </w:r>
+      <w:r>
+        <w:t xml:space="preserve"> </w:t>
+      </w:r>
+    </w:p>
+    <w:p>
+      <w:pPr>
+        <w:pStyle w:val="oancuaDanhsach"/>
+        <w:numPr>
+          <w:ilvl w:val="0"/>
+          <w:numId w:val="18"/>
+        </w:numPr>
+      </w:pPr>
+      <w:r>
+        <w:rPr>
+          <w:noProof/>
+        </w:rPr>
+        <w:drawing>
+          <wp:anchor distT="0" distB="0" distL="114300" distR="114300" simplePos="0" relativeHeight="251666432" behindDoc="1" locked="0" layoutInCell="1" allowOverlap="1" wp14:anchorId="79696076" wp14:editId="20414008">
+            <wp:simplePos x="0" y="0"/>
+            <wp:positionH relativeFrom="column">
+              <wp:posOffset>64770</wp:posOffset>
+            </wp:positionH>
+            <wp:positionV relativeFrom="paragraph">
+              <wp:posOffset>279400</wp:posOffset>
+            </wp:positionV>
+            <wp:extent cx="5528945" cy="2590800"/>
+            <wp:effectExtent l="0" t="0" r="0" b="0"/>
+            <wp:wrapTight wrapText="bothSides">
+              <wp:wrapPolygon edited="0">
+                <wp:start x="0" y="0"/>
+                <wp:lineTo x="0" y="21441"/>
+                <wp:lineTo x="21508" y="21441"/>
+                <wp:lineTo x="21508" y="0"/>
+                <wp:lineTo x="0" y="0"/>
+              </wp:wrapPolygon>
+            </wp:wrapTight>
+            <wp:docPr id="17" name="Hình ảnh 17" descr="Ảnh có chứa văn bản&#10;&#10;Mô tả được tạo tự động"/>
+            <wp:cNvGraphicFramePr>
+              <a:graphicFrameLocks xmlns:a="http://schemas.openxmlformats.org/drawingml/2006/main" noChangeAspect="1"/>
+            </wp:cNvGraphicFramePr>
+            <a:graphic xmlns:a="http://schemas.openxmlformats.org/drawingml/2006/main">
+              <a:graphicData uri="http://schemas.openxmlformats.org/drawingml/2006/picture">
+                <pic:pic xmlns:pic="http://schemas.openxmlformats.org/drawingml/2006/picture">
+                  <pic:nvPicPr>
+                    <pic:cNvPr id="17" name="Hình ảnh 17" descr="Ảnh có chứa văn bản&#10;&#10;Mô tả được tạo tự động"/>
+                    <pic:cNvPicPr/>
+                  </pic:nvPicPr>
+                  <pic:blipFill>
+                    <a:blip r:embed="rId19">
+                      <a:extLst>
+                        <a:ext uri="{28A0092B-C50C-407E-A947-70E740481C1C}">
+                          <a14:useLocalDpi xmlns:a14="http://schemas.microsoft.com/office/drawing/2010/main" val="0"/>
+                        </a:ext>
+                      </a:extLst>
+                    </a:blip>
+                    <a:stretch>
+                      <a:fillRect/>
+                    </a:stretch>
+                  </pic:blipFill>
+                  <pic:spPr>
+                    <a:xfrm>
+                      <a:off x="0" y="0"/>
+                      <a:ext cx="5528945" cy="2590800"/>
+                    </a:xfrm>
+                    <a:prstGeom prst="rect">
+                      <a:avLst/>
+                    </a:prstGeom>
+                  </pic:spPr>
+                </pic:pic>
+              </a:graphicData>
+            </a:graphic>
+            <wp14:sizeRelH relativeFrom="margin">
+              <wp14:pctWidth>0</wp14:pctWidth>
+            </wp14:sizeRelH>
+            <wp14:sizeRelV relativeFrom="margin">
+              <wp14:pctHeight>0</wp14:pctHeight>
+            </wp14:sizeRelV>
+          </wp:anchor>
+        </w:drawing>
+      </w:r>
+      <w:r>
+        <w:t xml:space="preserve">Chạy </w:t>
+      </w:r>
+      <w:r>
+        <w:t>Controller</w:t>
+      </w:r>
+      <w:r>
+        <w:t xml:space="preserve"> và mô </w:t>
+      </w:r>
+      <w:r>
+        <w:t>hình</w:t>
+      </w:r>
+      <w:r>
+        <w:t xml:space="preserve"> mạng</w:t>
+      </w:r>
+      <w:r>
+        <w:t xml:space="preserve">. </w:t>
+      </w:r>
+      <w:r>
+        <w:t>Tiến</w:t>
+      </w:r>
+      <w:r>
+        <w:t xml:space="preserve"> hành quá trình </w:t>
+      </w:r>
+      <w:r>
+        <w:rPr>
+          <w:b/>
+          <w:bCs/>
+          <w:lang w:val="en-US"/>
+        </w:rPr>
+        <w:t>h</w:t>
+      </w:r>
+      <w:r>
+        <w:rPr>
+          <w:b/>
+          <w:bCs/>
+          <w:lang w:val="en-US"/>
+        </w:rPr>
+        <w:t>1</w:t>
+      </w:r>
+      <w:r>
+        <w:rPr>
+          <w:b/>
+          <w:bCs/>
+          <w:lang w:val="en-US"/>
+        </w:rPr>
+        <w:t xml:space="preserve"> ping h4</w:t>
+      </w:r>
+    </w:p>
+    <w:p/>
+    <w:p>
+      <w:pPr>
+        <w:pStyle w:val="oancuaDanhsach"/>
+        <w:numPr>
+          <w:ilvl w:val="0"/>
+          <w:numId w:val="18"/>
+        </w:numPr>
+        <w:rPr>
+          <w:b/>
+          <w:bCs/>
+          <w:lang w:val="en-US"/>
+        </w:rPr>
+      </w:pPr>
+      <w:r>
+        <w:rPr>
+          <w:b/>
+          <w:bCs/>
+          <w:noProof/>
+          <w:lang w:val="en-US"/>
+        </w:rPr>
+        <w:lastRenderedPageBreak/>
+        <w:drawing>
+          <wp:anchor distT="0" distB="0" distL="114300" distR="114300" simplePos="0" relativeHeight="251664384" behindDoc="1" locked="0" layoutInCell="1" allowOverlap="1" wp14:anchorId="3F9C8153" wp14:editId="4D945871">
+            <wp:simplePos x="0" y="0"/>
+            <wp:positionH relativeFrom="column">
+              <wp:posOffset>-10795</wp:posOffset>
+            </wp:positionH>
+            <wp:positionV relativeFrom="paragraph">
+              <wp:posOffset>283845</wp:posOffset>
+            </wp:positionV>
+            <wp:extent cx="5516880" cy="5585460"/>
+            <wp:effectExtent l="0" t="0" r="7620" b="0"/>
+            <wp:wrapTight wrapText="bothSides">
+              <wp:wrapPolygon edited="0">
+                <wp:start x="0" y="0"/>
+                <wp:lineTo x="0" y="21512"/>
+                <wp:lineTo x="21555" y="21512"/>
+                <wp:lineTo x="21555" y="0"/>
+                <wp:lineTo x="0" y="0"/>
+              </wp:wrapPolygon>
+            </wp:wrapTight>
+            <wp:docPr id="8" name="Hình ảnh 8" descr="Ảnh có chứa văn bản&#10;&#10;Mô tả được tạo tự động"/>
+            <wp:cNvGraphicFramePr>
+              <a:graphicFrameLocks xmlns:a="http://schemas.openxmlformats.org/drawingml/2006/main" noChangeAspect="1"/>
+            </wp:cNvGraphicFramePr>
+            <a:graphic xmlns:a="http://schemas.openxmlformats.org/drawingml/2006/main">
+              <a:graphicData uri="http://schemas.openxmlformats.org/drawingml/2006/picture">
+                <pic:pic xmlns:pic="http://schemas.openxmlformats.org/drawingml/2006/picture">
+                  <pic:nvPicPr>
+                    <pic:cNvPr id="8" name="Hình ảnh 8" descr="Ảnh có chứa văn bản&#10;&#10;Mô tả được tạo tự động"/>
+                    <pic:cNvPicPr/>
+                  </pic:nvPicPr>
+                  <pic:blipFill>
+                    <a:blip r:embed="rId20">
+                      <a:extLst>
+                        <a:ext uri="{28A0092B-C50C-407E-A947-70E740481C1C}">
+                          <a14:useLocalDpi xmlns:a14="http://schemas.microsoft.com/office/drawing/2010/main" val="0"/>
+                        </a:ext>
+                      </a:extLst>
+                    </a:blip>
+                    <a:stretch>
+                      <a:fillRect/>
+                    </a:stretch>
+                  </pic:blipFill>
+                  <pic:spPr>
+                    <a:xfrm>
+                      <a:off x="0" y="0"/>
+                      <a:ext cx="5516880" cy="5585460"/>
+                    </a:xfrm>
+                    <a:prstGeom prst="rect">
+                      <a:avLst/>
+                    </a:prstGeom>
+                  </pic:spPr>
+                </pic:pic>
+              </a:graphicData>
+            </a:graphic>
+          </wp:anchor>
+        </w:drawing>
+      </w:r>
+      <w:r>
+        <w:rPr>
+          <w:b/>
+          <w:bCs/>
+          <w:lang w:val="en-US"/>
+        </w:rPr>
+        <w:t>h1 ping h3</w:t>
+      </w:r>
+    </w:p>
+    <w:p>
+      <w:pPr>
+        <w:pStyle w:val="oancuaDanhsach"/>
+        <w:numPr>
+          <w:ilvl w:val="0"/>
+          <w:numId w:val="18"/>
+        </w:numPr>
+        <w:rPr>
+          <w:b/>
+          <w:bCs/>
+          <w:lang w:val="en-US"/>
+        </w:rPr>
+      </w:pPr>
+      <w:r>
+        <w:rPr>
+          <w:b/>
+          <w:bCs/>
+          <w:lang w:val="en-US"/>
+        </w:rPr>
+        <w:t>h2 ping h3</w:t>
+      </w:r>
+    </w:p>
+    <w:p>
+      <w:pPr>
+        <w:rPr>
+          <w:lang w:val="en-US"/>
+        </w:rPr>
+      </w:pPr>
+      <w:r>
+        <w:rPr>
+          <w:noProof/>
+          <w:lang w:val="en-US"/>
+        </w:rPr>
+        <w:drawing>
+          <wp:inline distT="0" distB="0" distL="0" distR="0" wp14:anchorId="3FCC996B" wp14:editId="0BA480A5">
+            <wp:extent cx="5538074" cy="2369820"/>
+            <wp:effectExtent l="0" t="0" r="5715" b="0"/>
+            <wp:docPr id="15" name="Hình ảnh 15" descr="Ảnh có chứa văn bản&#10;&#10;Mô tả được tạo tự động"/>
+            <wp:cNvGraphicFramePr>
+              <a:graphicFrameLocks xmlns:a="http://schemas.openxmlformats.org/drawingml/2006/main" noChangeAspect="1"/>
+            </wp:cNvGraphicFramePr>
+            <a:graphic xmlns:a="http://schemas.openxmlformats.org/drawingml/2006/main">
+              <a:graphicData uri="http://schemas.openxmlformats.org/drawingml/2006/picture">
+                <pic:pic xmlns:pic="http://schemas.openxmlformats.org/drawingml/2006/picture">
+                  <pic:nvPicPr>
+                    <pic:cNvPr id="15" name="Hình ảnh 15" descr="Ảnh có chứa văn bản&#10;&#10;Mô tả được tạo tự động"/>
+                    <pic:cNvPicPr/>
+                  </pic:nvPicPr>
+                  <pic:blipFill>
+                    <a:blip r:embed="rId21">
+                      <a:extLst>
+                        <a:ext uri="{28A0092B-C50C-407E-A947-70E740481C1C}">
+                          <a14:useLocalDpi xmlns:a14="http://schemas.microsoft.com/office/drawing/2010/main" val="0"/>
+                        </a:ext>
+                      </a:extLst>
+                    </a:blip>
+                    <a:stretch>
+                      <a:fillRect/>
+                    </a:stretch>
+                  </pic:blipFill>
+                  <pic:spPr>
+                    <a:xfrm>
+                      <a:off x="0" y="0"/>
+                      <a:ext cx="5542511" cy="2371719"/>
+                    </a:xfrm>
+                    <a:prstGeom prst="rect">
+                      <a:avLst/>
+                    </a:prstGeom>
+                  </pic:spPr>
+                </pic:pic>
+              </a:graphicData>
+            </a:graphic>
+          </wp:inline>
+        </w:drawing>
+      </w:r>
+    </w:p>
+    <w:p>
+      <w:pPr>
+        <w:pStyle w:val="oancuaDanhsach"/>
+        <w:numPr>
+          <w:ilvl w:val="0"/>
+          <w:numId w:val="18"/>
+        </w:numPr>
+        <w:rPr>
+          <w:b/>
+          <w:bCs/>
+          <w:lang w:val="en-US"/>
+        </w:rPr>
+      </w:pPr>
+      <w:r>
+        <w:rPr>
+          <w:b/>
+          <w:bCs/>
+          <w:noProof/>
+          <w:lang w:val="en-US"/>
+        </w:rPr>
+        <w:lastRenderedPageBreak/>
+        <w:drawing>
+          <wp:anchor distT="0" distB="0" distL="114300" distR="114300" simplePos="0" relativeHeight="251665408" behindDoc="1" locked="0" layoutInCell="1" allowOverlap="1" wp14:anchorId="1D9533A3" wp14:editId="39A2B55B">
+            <wp:simplePos x="0" y="0"/>
+            <wp:positionH relativeFrom="column">
+              <wp:posOffset>-10795</wp:posOffset>
+            </wp:positionH>
+            <wp:positionV relativeFrom="paragraph">
+              <wp:posOffset>265430</wp:posOffset>
+            </wp:positionV>
+            <wp:extent cx="5579745" cy="3185160"/>
+            <wp:effectExtent l="0" t="0" r="1905" b="0"/>
+            <wp:wrapTight wrapText="bothSides">
+              <wp:wrapPolygon edited="0">
+                <wp:start x="0" y="0"/>
+                <wp:lineTo x="0" y="21445"/>
+                <wp:lineTo x="21534" y="21445"/>
+                <wp:lineTo x="21534" y="0"/>
+                <wp:lineTo x="0" y="0"/>
+              </wp:wrapPolygon>
+            </wp:wrapTight>
+            <wp:docPr id="16" name="Hình ảnh 16" descr="Ảnh có chứa văn bản&#10;&#10;Mô tả được tạo tự động"/>
+            <wp:cNvGraphicFramePr>
+              <a:graphicFrameLocks xmlns:a="http://schemas.openxmlformats.org/drawingml/2006/main" noChangeAspect="1"/>
+            </wp:cNvGraphicFramePr>
+            <a:graphic xmlns:a="http://schemas.openxmlformats.org/drawingml/2006/main">
+              <a:graphicData uri="http://schemas.openxmlformats.org/drawingml/2006/picture">
+                <pic:pic xmlns:pic="http://schemas.openxmlformats.org/drawingml/2006/picture">
+                  <pic:nvPicPr>
+                    <pic:cNvPr id="16" name="Hình ảnh 16" descr="Ảnh có chứa văn bản&#10;&#10;Mô tả được tạo tự động"/>
+                    <pic:cNvPicPr/>
+                  </pic:nvPicPr>
+                  <pic:blipFill>
+                    <a:blip r:embed="rId22" cstate="print">
+                      <a:extLst>
+                        <a:ext uri="{28A0092B-C50C-407E-A947-70E740481C1C}">
+                          <a14:useLocalDpi xmlns:a14="http://schemas.microsoft.com/office/drawing/2010/main" val="0"/>
+                        </a:ext>
+                      </a:extLst>
+                    </a:blip>
+                    <a:stretch>
+                      <a:fillRect/>
+                    </a:stretch>
+                  </pic:blipFill>
+                  <pic:spPr>
+                    <a:xfrm>
+                      <a:off x="0" y="0"/>
+                      <a:ext cx="5579745" cy="3185160"/>
+                    </a:xfrm>
+                    <a:prstGeom prst="rect">
+                      <a:avLst/>
+                    </a:prstGeom>
+                  </pic:spPr>
+                </pic:pic>
+              </a:graphicData>
+            </a:graphic>
+          </wp:anchor>
+        </w:drawing>
+      </w:r>
+      <w:r>
+        <w:rPr>
+          <w:b/>
+          <w:bCs/>
+        </w:rPr>
+        <w:t>Các</w:t>
+      </w:r>
+      <w:r>
+        <w:rPr>
+          <w:b/>
+          <w:bCs/>
+        </w:rPr>
+        <w:t xml:space="preserve"> </w:t>
+      </w:r>
+      <w:r>
+        <w:rPr>
+          <w:b/>
+          <w:bCs/>
+        </w:rPr>
+        <w:t>luồng</w:t>
+      </w:r>
+      <w:r>
+        <w:rPr>
+          <w:b/>
+          <w:bCs/>
+        </w:rPr>
+        <w:t xml:space="preserve"> </w:t>
+      </w:r>
+      <w:r>
+        <w:rPr>
+          <w:b/>
+          <w:bCs/>
+        </w:rPr>
+        <w:t>được</w:t>
+      </w:r>
+      <w:r>
+        <w:rPr>
+          <w:b/>
+          <w:bCs/>
+        </w:rPr>
+        <w:t xml:space="preserve"> cài ở </w:t>
+      </w:r>
+      <w:r>
+        <w:rPr>
+          <w:b/>
+          <w:bCs/>
+        </w:rPr>
+        <w:t>các</w:t>
+      </w:r>
+      <w:r>
+        <w:rPr>
+          <w:b/>
+          <w:bCs/>
+        </w:rPr>
+        <w:t xml:space="preserve"> </w:t>
+      </w:r>
+      <w:r>
+        <w:rPr>
+          <w:b/>
+          <w:bCs/>
+          <w:lang w:val="en-US"/>
+        </w:rPr>
+        <w:t xml:space="preserve">OpenFlow </w:t>
+      </w:r>
+      <w:r>
+        <w:rPr>
+          <w:b/>
+          <w:bCs/>
+          <w:lang w:val="en-US"/>
+        </w:rPr>
+        <w:t>switch</w:t>
+      </w:r>
+    </w:p>
+    <w:p>
+      <w:pPr>
+        <w:ind w:firstLine="360"/>
+        <w:rPr>
+          <w:i/>
+          <w:iCs/>
+        </w:rPr>
         <w:sectPr>
-          <w:footerReference w:type="default" r:id="rId12"/>
+          <w:footerReference w:type="default" r:id="rId23"/>
           <w:pgSz w:w="11906" w:h="16838"/>
           <w:pgMar w:top="1418" w:right="1134" w:bottom="1134" w:left="1985" w:header="708" w:footer="708" w:gutter="0"/>
           <w:pgNumType w:start="1"/>
@@ -1171,12 +3388,34 @@
           <w:docGrid w:linePitch="360"/>
         </w:sectPr>
       </w:pPr>
-      <w:bookmarkStart w:id="1" w:name="_Toc88417883"/>
-      <w:r>
-        <w:lastRenderedPageBreak/>
-        <w:t>TÌM KIẾM ĐƯỜNG ĐI NGẮN NHẤT TRONG MẠNG</w:t>
-      </w:r>
-      <w:bookmarkEnd w:id="1"/>
+      <w:r>
+        <w:rPr>
+          <w:i/>
+          <w:iCs/>
+        </w:rPr>
+        <w:t>Như</w:t>
+      </w:r>
+      <w:r>
+        <w:rPr>
+          <w:i/>
+          <w:iCs/>
+        </w:rPr>
+        <w:t xml:space="preserve"> vậy, toàn bộ quá trình </w:t>
+      </w:r>
+      <w:r>
+        <w:rPr>
+          <w:i/>
+          <w:iCs/>
+        </w:rPr>
+        <w:t>thực</w:t>
+      </w:r>
+      <w:r>
+        <w:rPr>
+          <w:i/>
+          <w:iCs/>
+        </w:rPr>
+        <w:t xml:space="preserve"> hiện đã thành công theo yêu cầu.</w:t>
+      </w:r>
     </w:p>
     <w:p>
       <w:pPr>
@@ -1191,51 +3430,118 @@
     <w:p>
       <w:pPr>
         <w:pStyle w:val="u1"/>
+      </w:pPr>
+      <w:bookmarkStart w:id="2" w:name="_TÀI_LIỆU_THAM"/>
+      <w:bookmarkStart w:id="3" w:name="_Toc90189585"/>
+      <w:bookmarkEnd w:id="2"/>
+      <w:r>
+        <w:rPr>
+          <w:lang w:val="en-US"/>
+        </w:rPr>
+        <w:lastRenderedPageBreak/>
+        <w:t>TÀI</w:t>
+      </w:r>
+      <w:r>
+        <w:t xml:space="preserve"> LIỆU THAM KHẢO</w:t>
+      </w:r>
+      <w:bookmarkEnd w:id="3"/>
+    </w:p>
+    <w:p>
+      <w:pPr>
+        <w:pStyle w:val="oancuaDanhsach"/>
         <w:numPr>
           <w:ilvl w:val="0"/>
-          <w:numId w:val="16"/>
+          <w:numId w:val="19"/>
         </w:numPr>
-        <w:sectPr>
-          <w:pgSz w:w="11906" w:h="16838"/>
-          <w:pgMar w:top="1418" w:right="1134" w:bottom="1134" w:left="1985" w:header="708" w:footer="708" w:gutter="0"/>
-          <w:cols w:space="708"/>
-          <w:docGrid w:linePitch="360"/>
-        </w:sectPr>
-      </w:pPr>
-      <w:bookmarkStart w:id="2" w:name="_Toc88417884"/>
-      <w:r>
-        <w:lastRenderedPageBreak/>
-        <w:t>KẾT QUẢ VÀ NHẬN XÉT</w:t>
-      </w:r>
-      <w:bookmarkEnd w:id="2"/>
+      </w:pPr>
+      <w:r>
+        <w:t>Hướng dẫn code</w:t>
+      </w:r>
+      <w:r>
+        <w:t xml:space="preserve"> </w:t>
+      </w:r>
+      <w:r>
+        <w:t>thuật</w:t>
+      </w:r>
+      <w:r>
+        <w:t xml:space="preserve"> toán Dijkstra cho RYU</w:t>
+      </w:r>
+      <w:r>
+        <w:rPr>
+          <w:lang w:val="en-US"/>
+        </w:rPr>
+        <w:t xml:space="preserve"> Controller</w:t>
+      </w:r>
+      <w:r>
+        <w:t xml:space="preserve">: </w:t>
+      </w:r>
+      <w:hyperlink r:id="rId24" w:history="1">
+        <w:r>
+          <w:rPr>
+            <w:rStyle w:val="Siuktni"/>
+          </w:rPr>
+          <w:t>http://csie.nqu.edu.tw/smallko/sdn/dijkstra_ryu.htm</w:t>
+        </w:r>
+      </w:hyperlink>
     </w:p>
     <w:p>
       <w:pPr>
-        <w:spacing w:line="259" w:lineRule="auto"/>
-      </w:pPr>
-      <w:r>
-        <w:lastRenderedPageBreak/>
-        <w:br w:type="page"/>
-      </w:r>
+        <w:pStyle w:val="oancuaDanhsach"/>
+        <w:numPr>
+          <w:ilvl w:val="0"/>
+          <w:numId w:val="19"/>
+        </w:numPr>
+      </w:pPr>
+      <w:r>
+        <w:t xml:space="preserve">Github: </w:t>
+      </w:r>
+      <w:hyperlink r:id="rId25" w:history="1">
+        <w:r>
+          <w:rPr>
+            <w:rStyle w:val="Siuktni"/>
+          </w:rPr>
+          <w:t>https://github.com/amitsk1994/mininet-RYU-ShortestPath</w:t>
+        </w:r>
+      </w:hyperlink>
     </w:p>
     <w:p>
       <w:pPr>
-        <w:pStyle w:val="u1"/>
-      </w:pPr>
-      <w:bookmarkStart w:id="3" w:name="_Toc88417885"/>
-      <w:r>
-        <w:rPr>
-          <w:lang w:val="en-US"/>
-        </w:rPr>
-        <w:lastRenderedPageBreak/>
-        <w:t>TÀI</w:t>
-      </w:r>
-      <w:r>
-        <w:t xml:space="preserve"> LIỆU THAM KHẢO</w:t>
-      </w:r>
-      <w:bookmarkEnd w:id="3"/>
+        <w:pStyle w:val="oancuaDanhsach"/>
+        <w:numPr>
+          <w:ilvl w:val="0"/>
+          <w:numId w:val="19"/>
+        </w:numPr>
+      </w:pPr>
+      <w:r>
+        <w:t xml:space="preserve">Website </w:t>
+      </w:r>
+      <w:r>
+        <w:t xml:space="preserve">Ryu, cung cấp hướng dẫn cho </w:t>
+      </w:r>
+      <w:r>
+        <w:t>việc</w:t>
+      </w:r>
+      <w:r>
+        <w:t xml:space="preserve"> cấu </w:t>
+      </w:r>
+      <w:r>
+        <w:t>hình</w:t>
+      </w:r>
+      <w:r>
+        <w:t xml:space="preserve"> chung</w:t>
+      </w:r>
+      <w:r>
+        <w:t xml:space="preserve">: </w:t>
+      </w:r>
+      <w:hyperlink r:id="rId26" w:history="1">
+        <w:r>
+          <w:rPr>
+            <w:rStyle w:val="Siuktni"/>
+          </w:rPr>
+          <w:t>https://ryu.readthedocs.io/en/latest/writing_ryu_app.html</w:t>
+        </w:r>
+      </w:hyperlink>
     </w:p>
-    <w:p/>
     <w:sectPr>
       <w:pgSz w:w="11906" w:h="16838"/>
       <w:pgMar w:top="1418" w:right="1134" w:bottom="1134" w:left="1985" w:header="708" w:footer="708" w:gutter="0"/>
@@ -1474,7 +3780,7 @@
             </mc:Choice>
             <mc:Fallback>
               <w:pict>
-                <v:group w14:anchorId="1FB6AF0F" id="Nhóm 10" o:spid="_x0000_s1026" style="width:43.2pt;height:18.7pt;mso-position-horizontal-relative:char;mso-position-vertical-relative:line" coordorigin="614,660" coordsize="864,374" o:gfxdata="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">
+                <v:group w14:anchorId="1FB6AF0F" id="Nhóm 10" o:spid="_x0000_s1026" style="width:43.2pt;height:18.7pt;mso-position-horizontal-relative:char;mso-position-vertical-relative:line" coordorigin="614,660" coordsize="864,374" o:gfxdata="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">
                   <v:roundrect id="AutoShape 47" o:spid="_x0000_s1027" style="position:absolute;left:859;top:415;width:374;height:864;rotation:-90;visibility:visible;mso-wrap-style:square;v-text-anchor:top" arcsize="10923f" o:gfxdata="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" strokecolor="#e4be84"/>
                   <v:roundrect id="AutoShape 48" o:spid="_x0000_s1028" style="position:absolute;left:898;top:451;width:296;height:792;rotation:-90;visibility:visible;mso-wrap-style:square;v-text-anchor:top" arcsize="10923f" o:gfxdata="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" fillcolor="#e4be84" strokecolor="#e4be84"/>
                   <v:shapetype id="_x0000_t202" coordsize="21600,21600" o:spt="202" path="m,l,21600r21600,l21600,xe">
@@ -1758,7 +4064,7 @@
             </mc:Choice>
             <mc:Fallback>
               <w:pict>
-                <v:group w14:anchorId="4562A8E4" id="Nhóm 22" o:spid="_x0000_s1030" style="width:43.2pt;height:18.7pt;mso-position-horizontal-relative:char;mso-position-vertical-relative:line" coordorigin="614,660" coordsize="864,374" o:gfxdata="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">
+                <v:group w14:anchorId="4562A8E4" id="Nhóm 22" o:spid="_x0000_s1030" style="width:43.2pt;height:18.7pt;mso-position-horizontal-relative:char;mso-position-vertical-relative:line" coordorigin="614,660" coordsize="864,374" o:gfxdata="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">
                   <v:roundrect id="AutoShape 47" o:spid="_x0000_s1031" style="position:absolute;left:859;top:415;width:374;height:864;rotation:-90;visibility:visible;mso-wrap-style:square;v-text-anchor:top" arcsize="10923f" o:gfxdata="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" strokecolor="#e4be84"/>
                   <v:roundrect id="AutoShape 48" o:spid="_x0000_s1032" style="position:absolute;left:898;top:451;width:296;height:792;rotation:-90;visibility:visible;mso-wrap-style:square;v-text-anchor:top" arcsize="10923f" o:gfxdata="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" fillcolor="#e4be84" strokecolor="#e4be84"/>
                   <v:shapetype id="_x0000_t202" coordsize="21600,21600" o:spt="202" path="m,l,21600r21600,l21600,xe">
@@ -2228,6 +4534,120 @@
     </w:lvl>
   </w:abstractNum>
   <w:abstractNum w:abstractNumId="4" w15:restartNumberingAfterBreak="0">
+    <w:nsid w:val="19BF7540"/>
+    <w:multiLevelType w:val="hybridMultilevel"/>
+    <w:tmpl w:val="7B1A1B18"/>
+    <w:lvl w:ilvl="0" w:tplc="8AB4B488">
+      <w:numFmt w:val="bullet"/>
+      <w:lvlText w:val="-"/>
+      <w:lvlJc w:val="left"/>
+      <w:pPr>
+        <w:ind w:left="720" w:hanging="360"/>
+      </w:pPr>
+      <w:rPr>
+        <w:rFonts w:ascii="Times New Roman" w:eastAsiaTheme="minorHAnsi" w:hAnsi="Times New Roman" w:cs="Times New Roman" w:hint="default"/>
+        <w:b w:val="0"/>
+        <w:sz w:val="26"/>
+      </w:rPr>
+    </w:lvl>
+    <w:lvl w:ilvl="1" w:tplc="042A0003" w:tentative="1">
+      <w:start w:val="1"/>
+      <w:numFmt w:val="bullet"/>
+      <w:lvlText w:val="o"/>
+      <w:lvlJc w:val="left"/>
+      <w:pPr>
+        <w:ind w:left="1440" w:hanging="360"/>
+      </w:pPr>
+      <w:rPr>
+        <w:rFonts w:ascii="Courier New" w:hAnsi="Courier New" w:cs="Courier New" w:hint="default"/>
+      </w:rPr>
+    </w:lvl>
+    <w:lvl w:ilvl="2" w:tplc="042A0005" w:tentative="1">
+      <w:start w:val="1"/>
+      <w:numFmt w:val="bullet"/>
+      <w:lvlText w:val=""/>
+      <w:lvlJc w:val="left"/>
+      <w:pPr>
+        <w:ind w:left="2160" w:hanging="360"/>
+      </w:pPr>
+      <w:rPr>
+        <w:rFonts w:ascii="Wingdings" w:hAnsi="Wingdings" w:hint="default"/>
+      </w:rPr>
+    </w:lvl>
+    <w:lvl w:ilvl="3" w:tplc="042A0001" w:tentative="1">
+      <w:start w:val="1"/>
+      <w:numFmt w:val="bullet"/>
+      <w:lvlText w:val=""/>
+      <w:lvlJc w:val="left"/>
+      <w:pPr>
+        <w:ind w:left="2880" w:hanging="360"/>
+      </w:pPr>
+      <w:rPr>
+        <w:rFonts w:ascii="Symbol" w:hAnsi="Symbol" w:hint="default"/>
+      </w:rPr>
+    </w:lvl>
+    <w:lvl w:ilvl="4" w:tplc="042A0003" w:tentative="1">
+      <w:start w:val="1"/>
+      <w:numFmt w:val="bullet"/>
+      <w:lvlText w:val="o"/>
+      <w:lvlJc w:val="left"/>
+      <w:pPr>
+        <w:ind w:left="3600" w:hanging="360"/>
+      </w:pPr>
+      <w:rPr>
+        <w:rFonts w:ascii="Courier New" w:hAnsi="Courier New" w:cs="Courier New" w:hint="default"/>
+      </w:rPr>
+    </w:lvl>
+    <w:lvl w:ilvl="5" w:tplc="042A0005" w:tentative="1">
+      <w:start w:val="1"/>
+      <w:numFmt w:val="bullet"/>
+      <w:lvlText w:val=""/>
+      <w:lvlJc w:val="left"/>
+      <w:pPr>
+        <w:ind w:left="4320" w:hanging="360"/>
+      </w:pPr>
+      <w:rPr>
+        <w:rFonts w:ascii="Wingdings" w:hAnsi="Wingdings" w:hint="default"/>
+      </w:rPr>
+    </w:lvl>
+    <w:lvl w:ilvl="6" w:tplc="042A0001" w:tentative="1">
+      <w:start w:val="1"/>
+      <w:numFmt w:val="bullet"/>
+      <w:lvlText w:val=""/>
+      <w:lvlJc w:val="left"/>
+      <w:pPr>
+        <w:ind w:left="5040" w:hanging="360"/>
+      </w:pPr>
+      <w:rPr>
+        <w:rFonts w:ascii="Symbol" w:hAnsi="Symbol" w:hint="default"/>
+      </w:rPr>
+    </w:lvl>
+    <w:lvl w:ilvl="7" w:tplc="042A0003" w:tentative="1">
+      <w:start w:val="1"/>
+      <w:numFmt w:val="bullet"/>
+      <w:lvlText w:val="o"/>
+      <w:lvlJc w:val="left"/>
+      <w:pPr>
+        <w:ind w:left="5760" w:hanging="360"/>
+      </w:pPr>
+      <w:rPr>
+        <w:rFonts w:ascii="Courier New" w:hAnsi="Courier New" w:cs="Courier New" w:hint="default"/>
+      </w:rPr>
+    </w:lvl>
+    <w:lvl w:ilvl="8" w:tplc="042A0005" w:tentative="1">
+      <w:start w:val="1"/>
+      <w:numFmt w:val="bullet"/>
+      <w:lvlText w:val=""/>
+      <w:lvlJc w:val="left"/>
+      <w:pPr>
+        <w:ind w:left="6480" w:hanging="360"/>
+      </w:pPr>
+      <w:rPr>
+        <w:rFonts w:ascii="Wingdings" w:hAnsi="Wingdings" w:hint="default"/>
+      </w:rPr>
+    </w:lvl>
+  </w:abstractNum>
+  <w:abstractNum w:abstractNumId="5" w15:restartNumberingAfterBreak="0">
     <w:nsid w:val="1C7323B6"/>
     <w:multiLevelType w:val="hybridMultilevel"/>
     <w:tmpl w:val="6C26488E"/>
@@ -2340,7 +4760,7 @@
       </w:rPr>
     </w:lvl>
   </w:abstractNum>
-  <w:abstractNum w:abstractNumId="5" w15:restartNumberingAfterBreak="0">
+  <w:abstractNum w:abstractNumId="6" w15:restartNumberingAfterBreak="0">
     <w:nsid w:val="1D2F3FEF"/>
     <w:multiLevelType w:val="hybridMultilevel"/>
     <w:tmpl w:val="1F6490C8"/>
@@ -2429,7 +4849,7 @@
       </w:pPr>
     </w:lvl>
   </w:abstractNum>
-  <w:abstractNum w:abstractNumId="6" w15:restartNumberingAfterBreak="0">
+  <w:abstractNum w:abstractNumId="7" w15:restartNumberingAfterBreak="0">
     <w:nsid w:val="37CE22C6"/>
     <w:multiLevelType w:val="hybridMultilevel"/>
     <w:tmpl w:val="D65073D4"/>
@@ -2518,7 +4938,7 @@
       </w:pPr>
     </w:lvl>
   </w:abstractNum>
-  <w:abstractNum w:abstractNumId="7" w15:restartNumberingAfterBreak="0">
+  <w:abstractNum w:abstractNumId="8" w15:restartNumberingAfterBreak="0">
     <w:nsid w:val="4483287F"/>
     <w:multiLevelType w:val="hybridMultilevel"/>
     <w:tmpl w:val="58320A06"/>
@@ -2607,7 +5027,7 @@
       </w:pPr>
     </w:lvl>
   </w:abstractNum>
-  <w:abstractNum w:abstractNumId="8" w15:restartNumberingAfterBreak="0">
+  <w:abstractNum w:abstractNumId="9" w15:restartNumberingAfterBreak="0">
     <w:nsid w:val="46817A28"/>
     <w:multiLevelType w:val="hybridMultilevel"/>
     <w:tmpl w:val="E5EC2854"/>
@@ -2696,7 +5116,7 @@
       </w:pPr>
     </w:lvl>
   </w:abstractNum>
-  <w:abstractNum w:abstractNumId="9" w15:restartNumberingAfterBreak="0">
+  <w:abstractNum w:abstractNumId="10" w15:restartNumberingAfterBreak="0">
     <w:nsid w:val="5C3F32EE"/>
     <w:multiLevelType w:val="hybridMultilevel"/>
     <w:tmpl w:val="5574A302"/>
@@ -2785,7 +5205,7 @@
       </w:pPr>
     </w:lvl>
   </w:abstractNum>
-  <w:abstractNum w:abstractNumId="10" w15:restartNumberingAfterBreak="0">
+  <w:abstractNum w:abstractNumId="11" w15:restartNumberingAfterBreak="0">
     <w:nsid w:val="5DDF7369"/>
     <w:multiLevelType w:val="hybridMultilevel"/>
     <w:tmpl w:val="D9B47202"/>
@@ -2874,7 +5294,7 @@
       </w:pPr>
     </w:lvl>
   </w:abstractNum>
-  <w:abstractNum w:abstractNumId="11" w15:restartNumberingAfterBreak="0">
+  <w:abstractNum w:abstractNumId="12" w15:restartNumberingAfterBreak="0">
     <w:nsid w:val="601C67E1"/>
     <w:multiLevelType w:val="hybridMultilevel"/>
     <w:tmpl w:val="AAC01800"/>
@@ -2986,7 +5406,208 @@
       </w:rPr>
     </w:lvl>
   </w:abstractNum>
-  <w:abstractNum w:abstractNumId="12" w15:restartNumberingAfterBreak="0">
+  <w:abstractNum w:abstractNumId="13" w15:restartNumberingAfterBreak="0">
+    <w:nsid w:val="67B72077"/>
+    <w:multiLevelType w:val="hybridMultilevel"/>
+    <w:tmpl w:val="B3FEB406"/>
+    <w:lvl w:ilvl="0" w:tplc="042A000F">
+      <w:start w:val="1"/>
+      <w:numFmt w:val="decimal"/>
+      <w:lvlText w:val="%1."/>
+      <w:lvlJc w:val="left"/>
+      <w:pPr>
+        <w:ind w:left="720" w:hanging="360"/>
+      </w:pPr>
+      <w:rPr>
+        <w:rFonts w:hint="default"/>
+      </w:rPr>
+    </w:lvl>
+    <w:lvl w:ilvl="1" w:tplc="042A0019" w:tentative="1">
+      <w:start w:val="1"/>
+      <w:numFmt w:val="lowerLetter"/>
+      <w:lvlText w:val="%2."/>
+      <w:lvlJc w:val="left"/>
+      <w:pPr>
+        <w:ind w:left="1440" w:hanging="360"/>
+      </w:pPr>
+    </w:lvl>
+    <w:lvl w:ilvl="2" w:tplc="042A001B" w:tentative="1">
+      <w:start w:val="1"/>
+      <w:numFmt w:val="lowerRoman"/>
+      <w:lvlText w:val="%3."/>
+      <w:lvlJc w:val="right"/>
+      <w:pPr>
+        <w:ind w:left="2160" w:hanging="180"/>
+      </w:pPr>
+    </w:lvl>
+    <w:lvl w:ilvl="3" w:tplc="042A000F" w:tentative="1">
+      <w:start w:val="1"/>
+      <w:numFmt w:val="decimal"/>
+      <w:lvlText w:val="%4."/>
+      <w:lvlJc w:val="left"/>
+      <w:pPr>
+        <w:ind w:left="2880" w:hanging="360"/>
+      </w:pPr>
+    </w:lvl>
+    <w:lvl w:ilvl="4" w:tplc="042A0019" w:tentative="1">
+      <w:start w:val="1"/>
+      <w:numFmt w:val="lowerLetter"/>
+      <w:lvlText w:val="%5."/>
+      <w:lvlJc w:val="left"/>
+      <w:pPr>
+        <w:ind w:left="3600" w:hanging="360"/>
+      </w:pPr>
+    </w:lvl>
+    <w:lvl w:ilvl="5" w:tplc="042A001B" w:tentative="1">
+      <w:start w:val="1"/>
+      <w:numFmt w:val="lowerRoman"/>
+      <w:lvlText w:val="%6."/>
+      <w:lvlJc w:val="right"/>
+      <w:pPr>
+        <w:ind w:left="4320" w:hanging="180"/>
+      </w:pPr>
+    </w:lvl>
+    <w:lvl w:ilvl="6" w:tplc="042A000F" w:tentative="1">
+      <w:start w:val="1"/>
+      <w:numFmt w:val="decimal"/>
+      <w:lvlText w:val="%7."/>
+      <w:lvlJc w:val="left"/>
+      <w:pPr>
+        <w:ind w:left="5040" w:hanging="360"/>
+      </w:pPr>
+    </w:lvl>
+    <w:lvl w:ilvl="7" w:tplc="042A0019" w:tentative="1">
+      <w:start w:val="1"/>
+      <w:numFmt w:val="lowerLetter"/>
+      <w:lvlText w:val="%8."/>
+      <w:lvlJc w:val="left"/>
+      <w:pPr>
+        <w:ind w:left="5760" w:hanging="360"/>
+      </w:pPr>
+    </w:lvl>
+    <w:lvl w:ilvl="8" w:tplc="042A001B" w:tentative="1">
+      <w:start w:val="1"/>
+      <w:numFmt w:val="lowerRoman"/>
+      <w:lvlText w:val="%9."/>
+      <w:lvlJc w:val="right"/>
+      <w:pPr>
+        <w:ind w:left="6480" w:hanging="180"/>
+      </w:pPr>
+    </w:lvl>
+  </w:abstractNum>
+  <w:abstractNum w:abstractNumId="14" w15:restartNumberingAfterBreak="0">
+    <w:nsid w:val="69E70AAA"/>
+    <w:multiLevelType w:val="hybridMultilevel"/>
+    <w:tmpl w:val="5238C372"/>
+    <w:lvl w:ilvl="0" w:tplc="0762B878">
+      <w:numFmt w:val="bullet"/>
+      <w:lvlText w:val="-"/>
+      <w:lvlJc w:val="left"/>
+      <w:pPr>
+        <w:ind w:left="720" w:hanging="360"/>
+      </w:pPr>
+      <w:rPr>
+        <w:rFonts w:ascii="Times New Roman" w:eastAsiaTheme="minorHAnsi" w:hAnsi="Times New Roman" w:cs="Times New Roman" w:hint="default"/>
+      </w:rPr>
+    </w:lvl>
+    <w:lvl w:ilvl="1" w:tplc="042A0003" w:tentative="1">
+      <w:start w:val="1"/>
+      <w:numFmt w:val="bullet"/>
+      <w:lvlText w:val="o"/>
+      <w:lvlJc w:val="left"/>
+      <w:pPr>
+        <w:ind w:left="1440" w:hanging="360"/>
+      </w:pPr>
+      <w:rPr>
+        <w:rFonts w:ascii="Courier New" w:hAnsi="Courier New" w:cs="Courier New" w:hint="default"/>
+      </w:rPr>
+    </w:lvl>
+    <w:lvl w:ilvl="2" w:tplc="042A0005" w:tentative="1">
+      <w:start w:val="1"/>
+      <w:numFmt w:val="bullet"/>
+      <w:lvlText w:val=""/>
+      <w:lvlJc w:val="left"/>
+      <w:pPr>
+        <w:ind w:left="2160" w:hanging="360"/>
+      </w:pPr>
+      <w:rPr>
+        <w:rFonts w:ascii="Wingdings" w:hAnsi="Wingdings" w:hint="default"/>
+      </w:rPr>
+    </w:lvl>
+    <w:lvl w:ilvl="3" w:tplc="042A0001" w:tentative="1">
+      <w:start w:val="1"/>
+      <w:numFmt w:val="bullet"/>
+      <w:lvlText w:val=""/>
+      <w:lvlJc w:val="left"/>
+      <w:pPr>
+        <w:ind w:left="2880" w:hanging="360"/>
+      </w:pPr>
+      <w:rPr>
+        <w:rFonts w:ascii="Symbol" w:hAnsi="Symbol" w:hint="default"/>
+      </w:rPr>
+    </w:lvl>
+    <w:lvl w:ilvl="4" w:tplc="042A0003" w:tentative="1">
+      <w:start w:val="1"/>
+      <w:numFmt w:val="bullet"/>
+      <w:lvlText w:val="o"/>
+      <w:lvlJc w:val="left"/>
+      <w:pPr>
+        <w:ind w:left="3600" w:hanging="360"/>
+      </w:pPr>
+      <w:rPr>
+        <w:rFonts w:ascii="Courier New" w:hAnsi="Courier New" w:cs="Courier New" w:hint="default"/>
+      </w:rPr>
+    </w:lvl>
+    <w:lvl w:ilvl="5" w:tplc="042A0005" w:tentative="1">
+      <w:start w:val="1"/>
+      <w:numFmt w:val="bullet"/>
+      <w:lvlText w:val=""/>
+      <w:lvlJc w:val="left"/>
+      <w:pPr>
+        <w:ind w:left="4320" w:hanging="360"/>
+      </w:pPr>
+      <w:rPr>
+        <w:rFonts w:ascii="Wingdings" w:hAnsi="Wingdings" w:hint="default"/>
+      </w:rPr>
+    </w:lvl>
+    <w:lvl w:ilvl="6" w:tplc="042A0001" w:tentative="1">
+      <w:start w:val="1"/>
+      <w:numFmt w:val="bullet"/>
+      <w:lvlText w:val=""/>
+      <w:lvlJc w:val="left"/>
+      <w:pPr>
+        <w:ind w:left="5040" w:hanging="360"/>
+      </w:pPr>
+      <w:rPr>
+        <w:rFonts w:ascii="Symbol" w:hAnsi="Symbol" w:hint="default"/>
+      </w:rPr>
+    </w:lvl>
+    <w:lvl w:ilvl="7" w:tplc="042A0003" w:tentative="1">
+      <w:start w:val="1"/>
+      <w:numFmt w:val="bullet"/>
+      <w:lvlText w:val="o"/>
+      <w:lvlJc w:val="left"/>
+      <w:pPr>
+        <w:ind w:left="5760" w:hanging="360"/>
+      </w:pPr>
+      <w:rPr>
+        <w:rFonts w:ascii="Courier New" w:hAnsi="Courier New" w:cs="Courier New" w:hint="default"/>
+      </w:rPr>
+    </w:lvl>
+    <w:lvl w:ilvl="8" w:tplc="042A0005" w:tentative="1">
+      <w:start w:val="1"/>
+      <w:numFmt w:val="bullet"/>
+      <w:lvlText w:val=""/>
+      <w:lvlJc w:val="left"/>
+      <w:pPr>
+        <w:ind w:left="6480" w:hanging="360"/>
+      </w:pPr>
+      <w:rPr>
+        <w:rFonts w:ascii="Wingdings" w:hAnsi="Wingdings" w:hint="default"/>
+      </w:rPr>
+    </w:lvl>
+  </w:abstractNum>
+  <w:abstractNum w:abstractNumId="15" w15:restartNumberingAfterBreak="0">
     <w:nsid w:val="6AA15EBE"/>
     <w:multiLevelType w:val="hybridMultilevel"/>
     <w:tmpl w:val="9BDE3B00"/>
@@ -3098,7 +5719,7 @@
       </w:rPr>
     </w:lvl>
   </w:abstractNum>
-  <w:abstractNum w:abstractNumId="13" w15:restartNumberingAfterBreak="0">
+  <w:abstractNum w:abstractNumId="16" w15:restartNumberingAfterBreak="0">
     <w:nsid w:val="772A5F56"/>
     <w:multiLevelType w:val="hybridMultilevel"/>
     <w:tmpl w:val="4BE28C44"/>
@@ -3187,7 +5808,7 @@
       </w:pPr>
     </w:lvl>
   </w:abstractNum>
-  <w:abstractNum w:abstractNumId="14" w15:restartNumberingAfterBreak="0">
+  <w:abstractNum w:abstractNumId="17" w15:restartNumberingAfterBreak="0">
     <w:nsid w:val="777B69E4"/>
     <w:multiLevelType w:val="hybridMultilevel"/>
     <w:tmpl w:val="7116D484"/>
@@ -3276,7 +5897,7 @@
       </w:pPr>
     </w:lvl>
   </w:abstractNum>
-  <w:abstractNum w:abstractNumId="15" w15:restartNumberingAfterBreak="0">
+  <w:abstractNum w:abstractNumId="18" w15:restartNumberingAfterBreak="0">
     <w:nsid w:val="7CFA6807"/>
     <w:multiLevelType w:val="hybridMultilevel"/>
     <w:tmpl w:val="8E0CD82E"/>
@@ -3366,52 +5987,61 @@
     </w:lvl>
   </w:abstractNum>
   <w:num w:numId="1">
-    <w:abstractNumId w:val="12"/>
+    <w:abstractNumId w:val="15"/>
   </w:num>
   <w:num w:numId="2">
     <w:abstractNumId w:val="3"/>
   </w:num>
   <w:num w:numId="3">
-    <w:abstractNumId w:val="5"/>
+    <w:abstractNumId w:val="6"/>
   </w:num>
   <w:num w:numId="4">
-    <w:abstractNumId w:val="9"/>
+    <w:abstractNumId w:val="10"/>
   </w:num>
   <w:num w:numId="5">
-    <w:abstractNumId w:val="7"/>
+    <w:abstractNumId w:val="8"/>
   </w:num>
   <w:num w:numId="6">
-    <w:abstractNumId w:val="14"/>
+    <w:abstractNumId w:val="17"/>
   </w:num>
   <w:num w:numId="7">
-    <w:abstractNumId w:val="13"/>
+    <w:abstractNumId w:val="16"/>
   </w:num>
   <w:num w:numId="8">
     <w:abstractNumId w:val="2"/>
   </w:num>
   <w:num w:numId="9">
-    <w:abstractNumId w:val="11"/>
+    <w:abstractNumId w:val="12"/>
   </w:num>
   <w:num w:numId="10">
-    <w:abstractNumId w:val="15"/>
+    <w:abstractNumId w:val="18"/>
   </w:num>
   <w:num w:numId="11">
-    <w:abstractNumId w:val="4"/>
+    <w:abstractNumId w:val="5"/>
   </w:num>
   <w:num w:numId="12">
     <w:abstractNumId w:val="1"/>
   </w:num>
   <w:num w:numId="13">
-    <w:abstractNumId w:val="10"/>
+    <w:abstractNumId w:val="11"/>
   </w:num>
   <w:num w:numId="14">
-    <w:abstractNumId w:val="6"/>
+    <w:abstractNumId w:val="7"/>
   </w:num>
   <w:num w:numId="15">
-    <w:abstractNumId w:val="8"/>
+    <w:abstractNumId w:val="9"/>
   </w:num>
   <w:num w:numId="16">
     <w:abstractNumId w:val="0"/>
+  </w:num>
+  <w:num w:numId="17">
+    <w:abstractNumId w:val="4"/>
+  </w:num>
+  <w:num w:numId="18">
+    <w:abstractNumId w:val="14"/>
+  </w:num>
+  <w:num w:numId="19">
+    <w:abstractNumId w:val="13"/>
   </w:num>
 </w:numbering>
 </file>
@@ -4333,13 +6963,255 @@
 </file>
 
 <file path=customXml/item1.xml><?xml version="1.0" encoding="utf-8"?>
+<p:properties xmlns:p="http://schemas.microsoft.com/office/2006/metadata/properties" xmlns:xsi="http://www.w3.org/2001/XMLSchema-instance" xmlns:pc="http://schemas.microsoft.com/office/infopath/2007/PartnerControls">
+  <documentManagement/>
+</p:properties>
+</file>
+
+<file path=customXml/item2.xml><?xml version="1.0" encoding="utf-8"?>
 <b:Sources xmlns:b="http://schemas.openxmlformats.org/officeDocument/2006/bibliography" xmlns="http://schemas.openxmlformats.org/officeDocument/2006/bibliography" SelectedStyle="\APASixthEditionOfficeOnline.xsl" StyleName="APA" Version="6"/>
 </file>
 
+<file path=customXml/item3.xml><?xml version="1.0" encoding="utf-8"?>
+<ct:contentTypeSchema xmlns:ct="http://schemas.microsoft.com/office/2006/metadata/contentType" xmlns:ma="http://schemas.microsoft.com/office/2006/metadata/properties/metaAttributes" ct:_="" ma:_="" ma:contentTypeName="Document" ma:contentTypeID="0x010100182A0FD1201485479895ED3ABF5F8B85" ma:contentTypeVersion="7" ma:contentTypeDescription="Create a new document." ma:contentTypeScope="" ma:versionID="079ee4fb2fabb65520d6a613be97d116">
+  <xsd:schema xmlns:xsd="http://www.w3.org/2001/XMLSchema" xmlns:xs="http://www.w3.org/2001/XMLSchema" xmlns:p="http://schemas.microsoft.com/office/2006/metadata/properties" xmlns:ns3="7b495183-be68-46b6-9f93-303bb4369acc" xmlns:ns4="e8900967-fe10-44ee-8cdd-dcc614f4f1dd" targetNamespace="http://schemas.microsoft.com/office/2006/metadata/properties" ma:root="true" ma:fieldsID="352e32c72f0a7a307122e470dfb98c00" ns3:_="" ns4:_="">
+    <xsd:import namespace="7b495183-be68-46b6-9f93-303bb4369acc"/>
+    <xsd:import namespace="e8900967-fe10-44ee-8cdd-dcc614f4f1dd"/>
+    <xsd:element name="properties">
+      <xsd:complexType>
+        <xsd:sequence>
+          <xsd:element name="documentManagement">
+            <xsd:complexType>
+              <xsd:all>
+                <xsd:element ref="ns3:MediaServiceMetadata" minOccurs="0"/>
+                <xsd:element ref="ns3:MediaServiceFastMetadata" minOccurs="0"/>
+                <xsd:element ref="ns3:MediaServiceDateTaken" minOccurs="0"/>
+                <xsd:element ref="ns3:MediaLengthInSeconds" minOccurs="0"/>
+                <xsd:element ref="ns4:SharedWithUsers" minOccurs="0"/>
+                <xsd:element ref="ns4:SharedWithDetails" minOccurs="0"/>
+                <xsd:element ref="ns4:SharingHintHash" minOccurs="0"/>
+              </xsd:all>
+            </xsd:complexType>
+          </xsd:element>
+        </xsd:sequence>
+      </xsd:complexType>
+    </xsd:element>
+  </xsd:schema>
+  <xsd:schema xmlns:xsd="http://www.w3.org/2001/XMLSchema" xmlns:xs="http://www.w3.org/2001/XMLSchema" xmlns:dms="http://schemas.microsoft.com/office/2006/documentManagement/types" xmlns:pc="http://schemas.microsoft.com/office/infopath/2007/PartnerControls" targetNamespace="7b495183-be68-46b6-9f93-303bb4369acc" elementFormDefault="qualified">
+    <xsd:import namespace="http://schemas.microsoft.com/office/2006/documentManagement/types"/>
+    <xsd:import namespace="http://schemas.microsoft.com/office/infopath/2007/PartnerControls"/>
+    <xsd:element name="MediaServiceMetadata" ma:index="8" nillable="true" ma:displayName="MediaServiceMetadata" ma:hidden="true" ma:internalName="MediaServiceMetadata" ma:readOnly="true">
+      <xsd:simpleType>
+        <xsd:restriction base="dms:Note"/>
+      </xsd:simpleType>
+    </xsd:element>
+    <xsd:element name="MediaServiceFastMetadata" ma:index="9" nillable="true" ma:displayName="MediaServiceFastMetadata" ma:hidden="true" ma:internalName="MediaServiceFastMetadata" ma:readOnly="true">
+      <xsd:simpleType>
+        <xsd:restriction base="dms:Note"/>
+      </xsd:simpleType>
+    </xsd:element>
+    <xsd:element name="MediaServiceDateTaken" ma:index="10" nillable="true" ma:displayName="MediaServiceDateTaken" ma:hidden="true" ma:internalName="MediaServiceDateTaken" ma:readOnly="true">
+      <xsd:simpleType>
+        <xsd:restriction base="dms:Text"/>
+      </xsd:simpleType>
+    </xsd:element>
+    <xsd:element name="MediaLengthInSeconds" ma:index="11" nillable="true" ma:displayName="Length (seconds)" ma:internalName="MediaLengthInSeconds" ma:readOnly="true">
+      <xsd:simpleType>
+        <xsd:restriction base="dms:Unknown"/>
+      </xsd:simpleType>
+    </xsd:element>
+  </xsd:schema>
+  <xsd:schema xmlns:xsd="http://www.w3.org/2001/XMLSchema" xmlns:xs="http://www.w3.org/2001/XMLSchema" xmlns:dms="http://schemas.microsoft.com/office/2006/documentManagement/types" xmlns:pc="http://schemas.microsoft.com/office/infopath/2007/PartnerControls" targetNamespace="e8900967-fe10-44ee-8cdd-dcc614f4f1dd" elementFormDefault="qualified">
+    <xsd:import namespace="http://schemas.microsoft.com/office/2006/documentManagement/types"/>
+    <xsd:import namespace="http://schemas.microsoft.com/office/infopath/2007/PartnerControls"/>
+    <xsd:element name="SharedWithUsers" ma:index="12" nillable="true" ma:displayName="Shared With" ma:internalName="SharedWithUsers" ma:readOnly="true">
+      <xsd:complexType>
+        <xsd:complexContent>
+          <xsd:extension base="dms:UserMulti">
+            <xsd:sequence>
+              <xsd:element name="UserInfo" minOccurs="0" maxOccurs="unbounded">
+                <xsd:complexType>
+                  <xsd:sequence>
+                    <xsd:element name="DisplayName" type="xsd:string" minOccurs="0"/>
+                    <xsd:element name="AccountId" type="dms:UserId" minOccurs="0" nillable="true"/>
+                    <xsd:element name="AccountType" type="xsd:string" minOccurs="0"/>
+                  </xsd:sequence>
+                </xsd:complexType>
+              </xsd:element>
+            </xsd:sequence>
+          </xsd:extension>
+        </xsd:complexContent>
+      </xsd:complexType>
+    </xsd:element>
+    <xsd:element name="SharedWithDetails" ma:index="13" nillable="true" ma:displayName="Shared With Details" ma:internalName="SharedWithDetails" ma:readOnly="true">
+      <xsd:simpleType>
+        <xsd:restriction base="dms:Note">
+          <xsd:maxLength value="255"/>
+        </xsd:restriction>
+      </xsd:simpleType>
+    </xsd:element>
+    <xsd:element name="SharingHintHash" ma:index="14" nillable="true" ma:displayName="Sharing Hint Hash" ma:hidden="true" ma:internalName="SharingHintHash" ma:readOnly="true">
+      <xsd:simpleType>
+        <xsd:restriction base="dms:Text"/>
+      </xsd:simpleType>
+    </xsd:element>
+  </xsd:schema>
+  <xsd:schema xmlns="http://schemas.openxmlformats.org/package/2006/metadata/core-properties" xmlns:xsd="http://www.w3.org/2001/XMLSchema" xmlns:xsi="http://www.w3.org/2001/XMLSchema-instance" xmlns:dc="http://purl.org/dc/elements/1.1/" xmlns:dcterms="http://purl.org/dc/terms/" xmlns:odoc="http://schemas.microsoft.com/internal/obd" targetNamespace="http://schemas.openxmlformats.org/package/2006/metadata/core-properties" elementFormDefault="qualified" attributeFormDefault="unqualified" blockDefault="#all">
+    <xsd:import namespace="http://purl.org/dc/elements/1.1/" schemaLocation="http://dublincore.org/schemas/xmls/qdc/2003/04/02/dc.xsd"/>
+    <xsd:import namespace="http://purl.org/dc/terms/" schemaLocation="http://dublincore.org/schemas/xmls/qdc/2003/04/02/dcterms.xsd"/>
+    <xsd:element name="coreProperties" type="CT_coreProperties"/>
+    <xsd:complexType name="CT_coreProperties">
+      <xsd:all>
+        <xsd:element ref="dc:creator" minOccurs="0" maxOccurs="1"/>
+        <xsd:element ref="dcterms:created" minOccurs="0" maxOccurs="1"/>
+        <xsd:element ref="dc:identifier" minOccurs="0" maxOccurs="1"/>
+        <xsd:element name="contentType" minOccurs="0" maxOccurs="1" type="xsd:string" ma:index="0" ma:displayName="Content Type"/>
+        <xsd:element ref="dc:title" minOccurs="0" maxOccurs="1" ma:index="4" ma:displayName="Title"/>
+        <xsd:element ref="dc:subject" minOccurs="0" maxOccurs="1"/>
+        <xsd:element ref="dc:description" minOccurs="0" maxOccurs="1"/>
+        <xsd:element name="keywords" minOccurs="0" maxOccurs="1" type="xsd:string"/>
+        <xsd:element ref="dc:language" minOccurs="0" maxOccurs="1"/>
+        <xsd:element name="category" minOccurs="0" maxOccurs="1" type="xsd:string"/>
+        <xsd:element name="version" minOccurs="0" maxOccurs="1" type="xsd:string"/>
+        <xsd:element name="revision" minOccurs="0" maxOccurs="1" type="xsd:string">
+          <xsd:annotation>
+            <xsd:documentation>
+                        This value indicates the number of saves or revisions. The application is responsible for updating this value after each revision.
+                    </xsd:documentation>
+          </xsd:annotation>
+        </xsd:element>
+        <xsd:element name="lastModifiedBy" minOccurs="0" maxOccurs="1" type="xsd:string"/>
+        <xsd:element ref="dcterms:modified" minOccurs="0" maxOccurs="1"/>
+        <xsd:element name="contentStatus" minOccurs="0" maxOccurs="1" type="xsd:string"/>
+      </xsd:all>
+    </xsd:complexType>
+  </xsd:schema>
+  <xs:schema xmlns:pc="http://schemas.microsoft.com/office/infopath/2007/PartnerControls" xmlns:xs="http://www.w3.org/2001/XMLSchema" targetNamespace="http://schemas.microsoft.com/office/infopath/2007/PartnerControls" elementFormDefault="qualified" attributeFormDefault="unqualified">
+    <xs:element name="Person">
+      <xs:complexType>
+        <xs:sequence>
+          <xs:element ref="pc:DisplayName" minOccurs="0"/>
+          <xs:element ref="pc:AccountId" minOccurs="0"/>
+          <xs:element ref="pc:AccountType" minOccurs="0"/>
+        </xs:sequence>
+      </xs:complexType>
+    </xs:element>
+    <xs:element name="DisplayName" type="xs:string"/>
+    <xs:element name="AccountId" type="xs:string"/>
+    <xs:element name="AccountType" type="xs:string"/>
+    <xs:element name="BDCAssociatedEntity">
+      <xs:complexType>
+        <xs:sequence>
+          <xs:element ref="pc:BDCEntity" minOccurs="0" maxOccurs="unbounded"/>
+        </xs:sequence>
+        <xs:attribute ref="pc:EntityNamespace"/>
+        <xs:attribute ref="pc:EntityName"/>
+        <xs:attribute ref="pc:SystemInstanceName"/>
+        <xs:attribute ref="pc:AssociationName"/>
+      </xs:complexType>
+    </xs:element>
+    <xs:attribute name="EntityNamespace" type="xs:string"/>
+    <xs:attribute name="EntityName" type="xs:string"/>
+    <xs:attribute name="SystemInstanceName" type="xs:string"/>
+    <xs:attribute name="AssociationName" type="xs:string"/>
+    <xs:element name="BDCEntity">
+      <xs:complexType>
+        <xs:sequence>
+          <xs:element ref="pc:EntityDisplayName" minOccurs="0"/>
+          <xs:element ref="pc:EntityInstanceReference" minOccurs="0"/>
+          <xs:element ref="pc:EntityId1" minOccurs="0"/>
+          <xs:element ref="pc:EntityId2" minOccurs="0"/>
+          <xs:element ref="pc:EntityId3" minOccurs="0"/>
+          <xs:element ref="pc:EntityId4" minOccurs="0"/>
+          <xs:element ref="pc:EntityId5" minOccurs="0"/>
+        </xs:sequence>
+      </xs:complexType>
+    </xs:element>
+    <xs:element name="EntityDisplayName" type="xs:string"/>
+    <xs:element name="EntityInstanceReference" type="xs:string"/>
+    <xs:element name="EntityId1" type="xs:string"/>
+    <xs:element name="EntityId2" type="xs:string"/>
+    <xs:element name="EntityId3" type="xs:string"/>
+    <xs:element name="EntityId4" type="xs:string"/>
+    <xs:element name="EntityId5" type="xs:string"/>
+    <xs:element name="Terms">
+      <xs:complexType>
+        <xs:sequence>
+          <xs:element ref="pc:TermInfo" minOccurs="0" maxOccurs="unbounded"/>
+        </xs:sequence>
+      </xs:complexType>
+    </xs:element>
+    <xs:element name="TermInfo">
+      <xs:complexType>
+        <xs:sequence>
+          <xs:element ref="pc:TermName" minOccurs="0"/>
+          <xs:element ref="pc:TermId" minOccurs="0"/>
+        </xs:sequence>
+      </xs:complexType>
+    </xs:element>
+    <xs:element name="TermName" type="xs:string"/>
+    <xs:element name="TermId" type="xs:string"/>
+  </xs:schema>
+</ct:contentTypeSchema>
+</file>
+
+<file path=customXml/item4.xml><?xml version="1.0" encoding="utf-8"?>
+<?mso-contentType ?>
+<FormTemplates xmlns="http://schemas.microsoft.com/sharepoint/v3/contenttype/forms">
+  <Display>DocumentLibraryForm</Display>
+  <Edit>DocumentLibraryForm</Edit>
+  <New>DocumentLibraryForm</New>
+</FormTemplates>
+</file>
+
 <file path=customXml/itemProps1.xml><?xml version="1.0" encoding="utf-8"?>
+<ds:datastoreItem xmlns:ds="http://schemas.openxmlformats.org/officeDocument/2006/customXml" ds:itemID="{E44CECCF-F66F-473B-AC7F-837EFEC708C6}">
+  <ds:schemaRefs>
+    <ds:schemaRef ds:uri="http://schemas.openxmlformats.org/package/2006/metadata/core-properties"/>
+    <ds:schemaRef ds:uri="http://schemas.microsoft.com/office/2006/documentManagement/types"/>
+    <ds:schemaRef ds:uri="http://purl.org/dc/dcmitype/"/>
+    <ds:schemaRef ds:uri="http://purl.org/dc/elements/1.1/"/>
+    <ds:schemaRef ds:uri="7b495183-be68-46b6-9f93-303bb4369acc"/>
+    <ds:schemaRef ds:uri="http://purl.org/dc/terms/"/>
+    <ds:schemaRef ds:uri="http://www.w3.org/XML/1998/namespace"/>
+    <ds:schemaRef ds:uri="http://schemas.microsoft.com/office/infopath/2007/PartnerControls"/>
+    <ds:schemaRef ds:uri="e8900967-fe10-44ee-8cdd-dcc614f4f1dd"/>
+    <ds:schemaRef ds:uri="http://schemas.microsoft.com/office/2006/metadata/properties"/>
+  </ds:schemaRefs>
+</ds:datastoreItem>
+</file>
+
+<file path=customXml/itemProps2.xml><?xml version="1.0" encoding="utf-8"?>
 <ds:datastoreItem xmlns:ds="http://schemas.openxmlformats.org/officeDocument/2006/customXml" ds:itemID="{0FA299CF-D688-4E6B-913D-6691019AC614}">
   <ds:schemaRefs>
     <ds:schemaRef ds:uri="http://schemas.openxmlformats.org/officeDocument/2006/bibliography"/>
   </ds:schemaRefs>
 </ds:datastoreItem>
+</file>
+
+<file path=customXml/itemProps3.xml><?xml version="1.0" encoding="utf-8"?>
+<ds:datastoreItem xmlns:ds="http://schemas.openxmlformats.org/officeDocument/2006/customXml" ds:itemID="{03E604AC-599E-4486-B8C2-F010480D5EEC}">
+  <ds:schemaRefs>
+    <ds:schemaRef ds:uri="http://schemas.microsoft.com/office/2006/metadata/contentType"/>
+    <ds:schemaRef ds:uri="http://schemas.microsoft.com/office/2006/metadata/properties/metaAttributes"/>
+    <ds:schemaRef ds:uri="http://www.w3.org/2001/XMLSchema"/>
+    <ds:schemaRef ds:uri="http://schemas.microsoft.com/office/2006/metadata/properties"/>
+    <ds:schemaRef ds:uri="7b495183-be68-46b6-9f93-303bb4369acc"/>
+    <ds:schemaRef ds:uri="e8900967-fe10-44ee-8cdd-dcc614f4f1dd"/>
+    <ds:schemaRef ds:uri="http://schemas.microsoft.com/office/2006/documentManagement/types"/>
+    <ds:schemaRef ds:uri="http://schemas.microsoft.com/office/infopath/2007/PartnerControls"/>
+    <ds:schemaRef ds:uri="http://schemas.openxmlformats.org/package/2006/metadata/core-properties"/>
+    <ds:schemaRef ds:uri="http://purl.org/dc/elements/1.1/"/>
+    <ds:schemaRef ds:uri="http://purl.org/dc/terms/"/>
+    <ds:schemaRef ds:uri="http://schemas.microsoft.com/internal/obd"/>
+  </ds:schemaRefs>
+</ds:datastoreItem>
+</file>
+
+<file path=customXml/itemProps4.xml><?xml version="1.0" encoding="utf-8"?>
+<ds:datastoreItem xmlns:ds="http://schemas.openxmlformats.org/officeDocument/2006/customXml" ds:itemID="{E4FA14BB-91F0-4943-9C73-FBEAAFE6AB72}">
+  <ds:schemaRefs>
+    <ds:schemaRef ds:uri="http://schemas.microsoft.com/sharepoint/v3/contenttype/forms"/>
+  </ds:schemaRefs>
+</ds:datastoreItem>
 </file>
</xml_diff>